<commit_message>
feat: add ERT / Medic operating station and bundle offline vendor assets
</commit_message>
<xml_diff>
--- a/Typhoon Evacuation - RDP.docx
+++ b/Typhoon Evacuation - RDP.docx
@@ -57,15 +57,31 @@
           <w:b/>
           <w:bCs/>
         </w:rPr>
-        <w:t xml:space="preserve">Rong Doi Platform: </w:t>
-      </w:r>
+        <w:t>Rong Doi Platform</w:t>
+      </w:r>
+      <w:proofErr w:type="gramStart"/>
       <w:r>
         <w:rPr>
           <w:b/>
           <w:bCs/>
         </w:rPr>
+        <w:t xml:space="preserve">: </w:t>
+      </w:r>
+      <w:r>
+        <w:rPr>
+          <w:b/>
+          <w:bCs/>
+        </w:rPr>
         <w:tab/>
-        <w:t>Lat: 7.7925</w:t>
+        <w:t>Lat</w:t>
+      </w:r>
+      <w:proofErr w:type="gramEnd"/>
+      <w:r>
+        <w:rPr>
+          <w:b/>
+          <w:bCs/>
+        </w:rPr>
+        <w:t>: 7.7925</w:t>
       </w:r>
       <w:r>
         <w:rPr>
@@ -329,7 +345,23 @@
           <w:rFonts w:ascii="Times New Roman"/>
           <w:sz w:val="24"/>
         </w:rPr>
-        <w:t xml:space="preserve"> else. The peak of the season is July through October, when nearly 70 percent of all typhoons develop. There is a noticeable seasonal shift in storm track in this region.</w:t>
+        <w:t xml:space="preserve"> else. The peak of the season is July through October, when nearly 70 percent of all typhoons develop. There is a noticeable seasonal shift in storm </w:t>
+      </w:r>
+      <w:proofErr w:type="gramStart"/>
+      <w:r>
+        <w:rPr>
+          <w:rFonts w:ascii="Times New Roman"/>
+          <w:sz w:val="24"/>
+        </w:rPr>
+        <w:t>track</w:t>
+      </w:r>
+      <w:proofErr w:type="gramEnd"/>
+      <w:r>
+        <w:rPr>
+          <w:rFonts w:ascii="Times New Roman"/>
+          <w:sz w:val="24"/>
+        </w:rPr>
+        <w:t xml:space="preserve"> in this region.</w:t>
       </w:r>
     </w:p>
     <w:p>
@@ -386,7 +418,39 @@
           <w:rFonts w:ascii="Times New Roman"/>
           <w:sz w:val="24"/>
         </w:rPr>
-        <w:t>The purpose of this procedure is to provide specific actions for responsible persons to take-in the event of a Tropical Revolving Storms (TRS) and in preparing Rong Doi Field for surviving any tropical storm.</w:t>
+        <w:t xml:space="preserve">The purpose of this procedure is to provide specific actions for responsible </w:t>
+      </w:r>
+      <w:proofErr w:type="gramStart"/>
+      <w:r>
+        <w:rPr>
+          <w:rFonts w:ascii="Times New Roman"/>
+          <w:sz w:val="24"/>
+        </w:rPr>
+        <w:t>persons</w:t>
+      </w:r>
+      <w:proofErr w:type="gramEnd"/>
+      <w:r>
+        <w:rPr>
+          <w:rFonts w:ascii="Times New Roman"/>
+          <w:sz w:val="24"/>
+        </w:rPr>
+        <w:t xml:space="preserve"> to </w:t>
+      </w:r>
+      <w:proofErr w:type="gramStart"/>
+      <w:r>
+        <w:rPr>
+          <w:rFonts w:ascii="Times New Roman"/>
+          <w:sz w:val="24"/>
+        </w:rPr>
+        <w:t>take-in</w:t>
+      </w:r>
+      <w:proofErr w:type="gramEnd"/>
+      <w:r>
+        <w:rPr>
+          <w:rFonts w:ascii="Times New Roman"/>
+          <w:sz w:val="24"/>
+        </w:rPr>
+        <w:t xml:space="preserve"> the event of a Tropical Revolving Storms (TRS) and in preparing Rong Doi Field for surviving any tropical storm.</w:t>
       </w:r>
     </w:p>
     <w:p>
@@ -479,7 +543,23 @@
           <w:rFonts w:ascii="Times New Roman"/>
           <w:sz w:val="24"/>
         </w:rPr>
-        <w:t xml:space="preserve"> plan to be adopted for evacuation of personnel from PUQC and </w:t>
+        <w:t xml:space="preserve"> </w:t>
+      </w:r>
+      <w:proofErr w:type="gramStart"/>
+      <w:r>
+        <w:rPr>
+          <w:rFonts w:ascii="Times New Roman"/>
+          <w:sz w:val="24"/>
+        </w:rPr>
+        <w:t>plan</w:t>
+      </w:r>
+      <w:proofErr w:type="gramEnd"/>
+      <w:r>
+        <w:rPr>
+          <w:rFonts w:ascii="Times New Roman"/>
+          <w:sz w:val="24"/>
+        </w:rPr>
+        <w:t xml:space="preserve"> to be adopted for evacuation of personnel from PUQC and </w:t>
       </w:r>
       <w:r>
         <w:rPr>
@@ -801,7 +881,27 @@
                 <w:color w:val="000000"/>
                 <w:sz w:val="24"/>
               </w:rPr>
-              <w:t>Start to revolving with wind speed less than 33 knots or force 6 and force 7 (Beaufort wind scale).</w:t>
+              <w:t xml:space="preserve">Start to </w:t>
+            </w:r>
+            <w:proofErr w:type="gramStart"/>
+            <w:r>
+              <w:rPr>
+                <w:rFonts w:ascii="Times New Roman"/>
+                <w:bCs/>
+                <w:color w:val="000000"/>
+                <w:sz w:val="24"/>
+              </w:rPr>
+              <w:t>revolving</w:t>
+            </w:r>
+            <w:proofErr w:type="gramEnd"/>
+            <w:r>
+              <w:rPr>
+                <w:rFonts w:ascii="Times New Roman"/>
+                <w:bCs/>
+                <w:color w:val="000000"/>
+                <w:sz w:val="24"/>
+              </w:rPr>
+              <w:t xml:space="preserve"> with wind speed less than 33 knots or force 6 and force 7 (Beaufort wind scale).</w:t>
             </w:r>
           </w:p>
         </w:tc>
@@ -1067,7 +1167,27 @@
                 <w:color w:val="000000"/>
                 <w:sz w:val="24"/>
               </w:rPr>
-              <w:t>Revolving with wind speed between 64 to 126 knots or force 12 (Beaufort wind scale-please refer to appendix 2).A tropical low that has developed to the point where 10 minutes sustained wind speed within the system are between 64 to 126 knots.</w:t>
+              <w:t>Revolving with wind speed between 64 to 126 knots or force 12 (Beaufort wind scale-please refer to appendix 2</w:t>
+            </w:r>
+            <w:proofErr w:type="gramStart"/>
+            <w:r>
+              <w:rPr>
+                <w:rFonts w:ascii="Times New Roman"/>
+                <w:bCs/>
+                <w:color w:val="000000"/>
+                <w:sz w:val="24"/>
+              </w:rPr>
+              <w:t>).A</w:t>
+            </w:r>
+            <w:proofErr w:type="gramEnd"/>
+            <w:r>
+              <w:rPr>
+                <w:rFonts w:ascii="Times New Roman"/>
+                <w:bCs/>
+                <w:color w:val="000000"/>
+                <w:sz w:val="24"/>
+              </w:rPr>
+              <w:t xml:space="preserve"> tropical low that has developed to the point where 10 minutes sustained wind speed within the system are between 64 to 126 knots.</w:t>
             </w:r>
           </w:p>
         </w:tc>
@@ -1188,7 +1308,27 @@
                 <w:color w:val="000000"/>
                 <w:sz w:val="24"/>
               </w:rPr>
-              <w:t xml:space="preserve"> sustained wind speed within the system exceed 127 knots.</w:t>
+              <w:t xml:space="preserve"> sustained wind speed within the system </w:t>
+            </w:r>
+            <w:proofErr w:type="gramStart"/>
+            <w:r>
+              <w:rPr>
+                <w:rFonts w:ascii="Times New Roman"/>
+                <w:bCs/>
+                <w:color w:val="000000"/>
+                <w:sz w:val="24"/>
+              </w:rPr>
+              <w:t>exceed</w:t>
+            </w:r>
+            <w:proofErr w:type="gramEnd"/>
+            <w:r>
+              <w:rPr>
+                <w:rFonts w:ascii="Times New Roman"/>
+                <w:bCs/>
+                <w:color w:val="000000"/>
+                <w:sz w:val="24"/>
+              </w:rPr>
+              <w:t xml:space="preserve"> 127 knots.</w:t>
             </w:r>
           </w:p>
         </w:tc>
@@ -1268,7 +1408,27 @@
           <w:sz w:val="24"/>
         </w:rPr>
         <w:lastRenderedPageBreak/>
-        <w:t xml:space="preserve">In addition, weather information can be received via dedicated Typhoon Warning Centre in Australia, Hong Kong, Tokyo and Navtex as well as some weather web site at Appendix </w:t>
+        <w:t xml:space="preserve">In addition, weather information can be received via dedicated Typhoon Warning Centre in Australia, Hong Kong, Tokyo and </w:t>
+      </w:r>
+      <w:proofErr w:type="spellStart"/>
+      <w:r>
+        <w:rPr>
+          <w:rFonts w:ascii="Times New Roman"/>
+          <w:bCs/>
+          <w:color w:val="000000"/>
+          <w:sz w:val="24"/>
+        </w:rPr>
+        <w:t>Navtex</w:t>
+      </w:r>
+      <w:proofErr w:type="spellEnd"/>
+      <w:r>
+        <w:rPr>
+          <w:rFonts w:ascii="Times New Roman"/>
+          <w:bCs/>
+          <w:color w:val="000000"/>
+          <w:sz w:val="24"/>
+        </w:rPr>
+        <w:t xml:space="preserve"> as well as some weather web site at Appendix </w:t>
       </w:r>
     </w:p>
     <w:p>
@@ -1300,8 +1460,9 @@
           <w:color w:val="000000"/>
           <w:sz w:val="24"/>
         </w:rPr>
-        <w:t xml:space="preserve">Reporting Frequency: The contracted weather service provider will provide 72 hours weather forecast to </w:t>
-      </w:r>
+        <w:t xml:space="preserve">Reporting Frequency: The contracted weather service provider will provide 72 hours weather forecast </w:t>
+      </w:r>
+      <w:proofErr w:type="gramStart"/>
       <w:r>
         <w:rPr>
           <w:rFonts w:ascii="Times New Roman"/>
@@ -1309,8 +1470,9 @@
           <w:color w:val="000000"/>
           <w:sz w:val="24"/>
         </w:rPr>
-        <w:t>ZNEPV</w:t>
-      </w:r>
+        <w:t>to</w:t>
+      </w:r>
+      <w:proofErr w:type="gramEnd"/>
       <w:r>
         <w:rPr>
           <w:rFonts w:ascii="Times New Roman"/>
@@ -1318,6 +1480,24 @@
           <w:color w:val="000000"/>
           <w:sz w:val="24"/>
         </w:rPr>
+        <w:t xml:space="preserve"> </w:t>
+      </w:r>
+      <w:r>
+        <w:rPr>
+          <w:rFonts w:ascii="Times New Roman"/>
+          <w:bCs/>
+          <w:color w:val="000000"/>
+          <w:sz w:val="24"/>
+        </w:rPr>
+        <w:t>ZNEPV</w:t>
+      </w:r>
+      <w:r>
+        <w:rPr>
+          <w:rFonts w:ascii="Times New Roman"/>
+          <w:bCs/>
+          <w:color w:val="000000"/>
+          <w:sz w:val="24"/>
+        </w:rPr>
         <w:t xml:space="preserve"> as below:</w:t>
       </w:r>
     </w:p>
@@ -1352,8 +1532,9 @@
           <w:sz w:val="24"/>
         </w:rPr>
         <w:tab/>
-        <w:t>Routine Range Forecast</w:t>
-      </w:r>
+        <w:t xml:space="preserve">Routine Range </w:t>
+      </w:r>
+      <w:proofErr w:type="gramStart"/>
       <w:r>
         <w:rPr>
           <w:rFonts w:ascii="Times New Roman"/>
@@ -1361,7 +1542,7 @@
           <w:color w:val="000000"/>
           <w:sz w:val="24"/>
         </w:rPr>
-        <w:tab/>
+        <w:t>Forecast</w:t>
       </w:r>
       <w:r>
         <w:rPr>
@@ -1371,7 +1552,26 @@
           <w:sz w:val="24"/>
         </w:rPr>
         <w:tab/>
-        <w:t>- Updated every 12 hour</w:t>
+      </w:r>
+      <w:r>
+        <w:rPr>
+          <w:rFonts w:ascii="Times New Roman"/>
+          <w:bCs/>
+          <w:color w:val="000000"/>
+          <w:sz w:val="24"/>
+        </w:rPr>
+        <w:tab/>
+        <w:t>-</w:t>
+      </w:r>
+      <w:proofErr w:type="gramEnd"/>
+      <w:r>
+        <w:rPr>
+          <w:rFonts w:ascii="Times New Roman"/>
+          <w:bCs/>
+          <w:color w:val="000000"/>
+          <w:sz w:val="24"/>
+        </w:rPr>
+        <w:t xml:space="preserve"> Updated every 12 hour</w:t>
       </w:r>
       <w:r>
         <w:rPr>
@@ -1601,7 +1801,27 @@
           <w:color w:val="000000"/>
           <w:sz w:val="24"/>
         </w:rPr>
-        <w:t xml:space="preserve"> to track the path of approaching severe weather in order for appropriate actions to be taken to enable an orderly evacuation.</w:t>
+        <w:t xml:space="preserve"> to track the path of approaching severe weather </w:t>
+      </w:r>
+      <w:proofErr w:type="gramStart"/>
+      <w:r>
+        <w:rPr>
+          <w:rFonts w:ascii="Times New Roman"/>
+          <w:bCs/>
+          <w:color w:val="000000"/>
+          <w:sz w:val="24"/>
+        </w:rPr>
+        <w:t>in order for</w:t>
+      </w:r>
+      <w:proofErr w:type="gramEnd"/>
+      <w:r>
+        <w:rPr>
+          <w:rFonts w:ascii="Times New Roman"/>
+          <w:bCs/>
+          <w:color w:val="000000"/>
+          <w:sz w:val="24"/>
+        </w:rPr>
+        <w:t xml:space="preserve"> appropriate actions to be taken to enable an orderly evacuation.</w:t>
       </w:r>
     </w:p>
     <w:p>
@@ -1644,7 +1864,23 @@
           <w:rFonts w:ascii="Times New Roman"/>
           <w:sz w:val="24"/>
         </w:rPr>
-        <w:t>To ensure all concerned personnel are kept informed and timely response to severe typhoon, a three color coding system for ‘STORM ALERT’ is recommended.</w:t>
+        <w:t xml:space="preserve">To ensure all concerned personnel are kept informed and timely response to severe typhoon, a </w:t>
+      </w:r>
+      <w:proofErr w:type="gramStart"/>
+      <w:r>
+        <w:rPr>
+          <w:rFonts w:ascii="Times New Roman"/>
+          <w:sz w:val="24"/>
+        </w:rPr>
+        <w:t>three color</w:t>
+      </w:r>
+      <w:proofErr w:type="gramEnd"/>
+      <w:r>
+        <w:rPr>
+          <w:rFonts w:ascii="Times New Roman"/>
+          <w:sz w:val="24"/>
+        </w:rPr>
+        <w:t xml:space="preserve"> coding system for ‘STORM ALERT’ is recommended.</w:t>
       </w:r>
     </w:p>
     <w:p>
@@ -2074,7 +2310,47 @@
                 <w:color w:val="000000"/>
                 <w:sz w:val="24"/>
               </w:rPr>
-              <w:t>status does not have any impact on normal offshore operations; however it initiates tightened safety measure at offshore.</w:t>
+              <w:t xml:space="preserve">status does not have any impact on normal offshore operations; </w:t>
+            </w:r>
+            <w:proofErr w:type="gramStart"/>
+            <w:r>
+              <w:rPr>
+                <w:rFonts w:ascii="Times New Roman"/>
+                <w:bCs/>
+                <w:color w:val="000000"/>
+                <w:sz w:val="24"/>
+              </w:rPr>
+              <w:t>however</w:t>
+            </w:r>
+            <w:proofErr w:type="gramEnd"/>
+            <w:r>
+              <w:rPr>
+                <w:rFonts w:ascii="Times New Roman"/>
+                <w:bCs/>
+                <w:color w:val="000000"/>
+                <w:sz w:val="24"/>
+              </w:rPr>
+              <w:t xml:space="preserve"> it initiates tightened safety </w:t>
+            </w:r>
+            <w:proofErr w:type="gramStart"/>
+            <w:r>
+              <w:rPr>
+                <w:rFonts w:ascii="Times New Roman"/>
+                <w:bCs/>
+                <w:color w:val="000000"/>
+                <w:sz w:val="24"/>
+              </w:rPr>
+              <w:t>measure at</w:t>
+            </w:r>
+            <w:proofErr w:type="gramEnd"/>
+            <w:r>
+              <w:rPr>
+                <w:rFonts w:ascii="Times New Roman"/>
+                <w:bCs/>
+                <w:color w:val="000000"/>
+                <w:sz w:val="24"/>
+              </w:rPr>
+              <w:t xml:space="preserve"> offshore.</w:t>
             </w:r>
           </w:p>
         </w:tc>
@@ -2441,14 +2717,25 @@
               </w:rPr>
               <w:t>e</w:t>
             </w:r>
-            <w:r>
-              <w:rPr>
-                <w:rFonts w:ascii="Times New Roman"/>
-                <w:bCs/>
-                <w:color w:val="000000"/>
-                <w:sz w:val="24"/>
-              </w:rPr>
-              <w:t>ver is least.</w:t>
+            <w:proofErr w:type="spellStart"/>
+            <w:r>
+              <w:rPr>
+                <w:rFonts w:ascii="Times New Roman"/>
+                <w:bCs/>
+                <w:color w:val="000000"/>
+                <w:sz w:val="24"/>
+              </w:rPr>
+              <w:t>ver</w:t>
+            </w:r>
+            <w:proofErr w:type="spellEnd"/>
+            <w:r>
+              <w:rPr>
+                <w:rFonts w:ascii="Times New Roman"/>
+                <w:bCs/>
+                <w:color w:val="000000"/>
+                <w:sz w:val="24"/>
+              </w:rPr>
+              <w:t xml:space="preserve"> is least.</w:t>
             </w:r>
           </w:p>
           <w:p>
@@ -2950,8 +3237,19 @@
           <w:sz w:val="24"/>
         </w:rPr>
         <w:tab/>
-        <w:t>‘Rr’ = Rt x Sm</w:t>
-      </w:r>
+        <w:t xml:space="preserve">‘Rr’ = Rt x </w:t>
+      </w:r>
+      <w:proofErr w:type="spellStart"/>
+      <w:r>
+        <w:rPr>
+          <w:rFonts w:ascii="Times New Roman"/>
+          <w:bCs/>
+          <w:color w:val="000000"/>
+          <w:sz w:val="24"/>
+        </w:rPr>
+        <w:t>Sm</w:t>
+      </w:r>
+      <w:proofErr w:type="spellEnd"/>
     </w:p>
     <w:p>
       <w:pPr>
@@ -3051,7 +3349,27 @@
           <w:color w:val="000000"/>
           <w:sz w:val="24"/>
         </w:rPr>
-        <w:t>‘Sm’ is “STORM movement”. Is the latest forecast from the MET office of the speed of advances of the STORM eye?</w:t>
+        <w:t>‘</w:t>
+      </w:r>
+      <w:proofErr w:type="spellStart"/>
+      <w:r>
+        <w:rPr>
+          <w:rFonts w:ascii="Times New Roman"/>
+          <w:bCs/>
+          <w:color w:val="000000"/>
+          <w:sz w:val="24"/>
+        </w:rPr>
+        <w:t>Sm</w:t>
+      </w:r>
+      <w:proofErr w:type="spellEnd"/>
+      <w:r>
+        <w:rPr>
+          <w:rFonts w:ascii="Times New Roman"/>
+          <w:bCs/>
+          <w:color w:val="000000"/>
+          <w:sz w:val="24"/>
+        </w:rPr>
+        <w:t>’ is “STORM movement”. Is the latest forecast from the MET office of the speed of advances of the STORM eye?</w:t>
       </w:r>
     </w:p>
     <w:p>
@@ -3335,7 +3653,47 @@
           <w:color w:val="000000"/>
           <w:sz w:val="24"/>
         </w:rPr>
-        <w:t>A RED radius calculation base on a storm eye moving at ‘Sm’=10 knots and the response time ‘Rt’= 24 hours.</w:t>
+        <w:t xml:space="preserve">A RED radius calculation </w:t>
+      </w:r>
+      <w:proofErr w:type="gramStart"/>
+      <w:r>
+        <w:rPr>
+          <w:rFonts w:ascii="Times New Roman"/>
+          <w:bCs/>
+          <w:color w:val="000000"/>
+          <w:sz w:val="24"/>
+        </w:rPr>
+        <w:t>base</w:t>
+      </w:r>
+      <w:proofErr w:type="gramEnd"/>
+      <w:r>
+        <w:rPr>
+          <w:rFonts w:ascii="Times New Roman"/>
+          <w:bCs/>
+          <w:color w:val="000000"/>
+          <w:sz w:val="24"/>
+        </w:rPr>
+        <w:t xml:space="preserve"> on a storm eye moving at ‘</w:t>
+      </w:r>
+      <w:proofErr w:type="spellStart"/>
+      <w:r>
+        <w:rPr>
+          <w:rFonts w:ascii="Times New Roman"/>
+          <w:bCs/>
+          <w:color w:val="000000"/>
+          <w:sz w:val="24"/>
+        </w:rPr>
+        <w:t>Sm</w:t>
+      </w:r>
+      <w:proofErr w:type="spellEnd"/>
+      <w:r>
+        <w:rPr>
+          <w:rFonts w:ascii="Times New Roman"/>
+          <w:bCs/>
+          <w:color w:val="000000"/>
+          <w:sz w:val="24"/>
+        </w:rPr>
+        <w:t>’=10 knots and the response time ‘Rt’= 24 hours.</w:t>
       </w:r>
     </w:p>
     <w:p>
@@ -3369,7 +3727,27 @@
           <w:color w:val="000000"/>
           <w:sz w:val="24"/>
         </w:rPr>
-        <w:t>‘Rr’ = 24 hrs x 10 knots</w:t>
+        <w:t xml:space="preserve">‘Rr’ = 24 </w:t>
+      </w:r>
+      <w:proofErr w:type="spellStart"/>
+      <w:r>
+        <w:rPr>
+          <w:rFonts w:ascii="Times New Roman"/>
+          <w:bCs/>
+          <w:color w:val="000000"/>
+          <w:sz w:val="24"/>
+        </w:rPr>
+        <w:t>hrs</w:t>
+      </w:r>
+      <w:proofErr w:type="spellEnd"/>
+      <w:r>
+        <w:rPr>
+          <w:rFonts w:ascii="Times New Roman"/>
+          <w:bCs/>
+          <w:color w:val="000000"/>
+          <w:sz w:val="24"/>
+        </w:rPr>
+        <w:t xml:space="preserve"> x 10 knots</w:t>
       </w:r>
     </w:p>
     <w:p>
@@ -3572,7 +3950,27 @@
           <w:sz w:val="24"/>
         </w:rPr>
         <w:tab/>
-        <w:t>‘Yr’= Rr + (Sot x Sm)</w:t>
+        <w:t xml:space="preserve">‘Yr’= Rr + (Sot x </w:t>
+      </w:r>
+      <w:proofErr w:type="spellStart"/>
+      <w:r>
+        <w:rPr>
+          <w:rFonts w:ascii="Times New Roman"/>
+          <w:bCs/>
+          <w:color w:val="000000"/>
+          <w:sz w:val="24"/>
+        </w:rPr>
+        <w:t>Sm</w:t>
+      </w:r>
+      <w:proofErr w:type="spellEnd"/>
+      <w:r>
+        <w:rPr>
+          <w:rFonts w:ascii="Times New Roman"/>
+          <w:bCs/>
+          <w:color w:val="000000"/>
+          <w:sz w:val="24"/>
+        </w:rPr>
+        <w:t>)</w:t>
       </w:r>
     </w:p>
     <w:p>
@@ -3770,7 +4168,27 @@
           <w:sz w:val="24"/>
         </w:rPr>
         <w:tab/>
-        <w:t>‘Sm’ is “STORM movement”</w:t>
+        <w:t>‘</w:t>
+      </w:r>
+      <w:proofErr w:type="spellStart"/>
+      <w:r>
+        <w:rPr>
+          <w:rFonts w:ascii="Times New Roman"/>
+          <w:bCs/>
+          <w:color w:val="000000"/>
+          <w:sz w:val="24"/>
+        </w:rPr>
+        <w:t>Sm</w:t>
+      </w:r>
+      <w:proofErr w:type="spellEnd"/>
+      <w:r>
+        <w:rPr>
+          <w:rFonts w:ascii="Times New Roman"/>
+          <w:bCs/>
+          <w:color w:val="000000"/>
+          <w:sz w:val="24"/>
+        </w:rPr>
+        <w:t>’ is “STORM movement”</w:t>
       </w:r>
     </w:p>
     <w:p>
@@ -4029,7 +4447,17 @@
                 <w:color w:val="000000"/>
                 <w:sz w:val="24"/>
               </w:rPr>
-              <w:t>45 n</w:t>
+              <w:t xml:space="preserve">45 </w:t>
+            </w:r>
+            <w:proofErr w:type="spellStart"/>
+            <w:r>
+              <w:rPr>
+                <w:rFonts w:ascii="Times New Roman"/>
+                <w:bCs/>
+                <w:color w:val="000000"/>
+                <w:sz w:val="24"/>
+              </w:rPr>
+              <w:t>n</w:t>
             </w:r>
             <w:r>
               <w:rPr>
@@ -4040,6 +4468,7 @@
               </w:rPr>
               <w:t>M</w:t>
             </w:r>
+            <w:proofErr w:type="spellEnd"/>
           </w:p>
         </w:tc>
       </w:tr>
@@ -4078,6 +4507,7 @@
           <w:sz w:val="24"/>
         </w:rPr>
       </w:pPr>
+      <w:proofErr w:type="gramStart"/>
       <w:r>
         <w:rPr>
           <w:rFonts w:ascii="Times New Roman"/>
@@ -4085,7 +4515,17 @@
           <w:color w:val="000000"/>
           <w:sz w:val="24"/>
         </w:rPr>
-        <w:t>Sot = 12 hours</w:t>
+        <w:t>Sot</w:t>
+      </w:r>
+      <w:proofErr w:type="gramEnd"/>
+      <w:r>
+        <w:rPr>
+          <w:rFonts w:ascii="Times New Roman"/>
+          <w:bCs/>
+          <w:color w:val="000000"/>
+          <w:sz w:val="24"/>
+        </w:rPr>
+        <w:t xml:space="preserve"> = 12 hours</w:t>
       </w:r>
     </w:p>
     <w:p>
@@ -4107,7 +4547,27 @@
           <w:color w:val="000000"/>
           <w:sz w:val="24"/>
         </w:rPr>
-        <w:t>Yr = 240nM + (12 hrs x 10 Knots)</w:t>
+        <w:t xml:space="preserve">Yr = 240nM + (12 </w:t>
+      </w:r>
+      <w:proofErr w:type="spellStart"/>
+      <w:r>
+        <w:rPr>
+          <w:rFonts w:ascii="Times New Roman"/>
+          <w:bCs/>
+          <w:color w:val="000000"/>
+          <w:sz w:val="24"/>
+        </w:rPr>
+        <w:t>hrs</w:t>
+      </w:r>
+      <w:proofErr w:type="spellEnd"/>
+      <w:r>
+        <w:rPr>
+          <w:rFonts w:ascii="Times New Roman"/>
+          <w:bCs/>
+          <w:color w:val="000000"/>
+          <w:sz w:val="24"/>
+        </w:rPr>
+        <w:t xml:space="preserve"> x 10 Knots)</w:t>
       </w:r>
     </w:p>
     <w:p>
@@ -4670,7 +5130,27 @@
                 <w:color w:val="000000"/>
                 <w:sz w:val="24"/>
               </w:rPr>
-              <w:t>and advice the current operation status.</w:t>
+              <w:t xml:space="preserve">and </w:t>
+            </w:r>
+            <w:proofErr w:type="gramStart"/>
+            <w:r>
+              <w:rPr>
+                <w:rFonts w:ascii="Times New Roman"/>
+                <w:bCs/>
+                <w:color w:val="000000"/>
+                <w:sz w:val="24"/>
+              </w:rPr>
+              <w:t>advice</w:t>
+            </w:r>
+            <w:proofErr w:type="gramEnd"/>
+            <w:r>
+              <w:rPr>
+                <w:rFonts w:ascii="Times New Roman"/>
+                <w:bCs/>
+                <w:color w:val="000000"/>
+                <w:sz w:val="24"/>
+              </w:rPr>
+              <w:t xml:space="preserve"> the current operation status.</w:t>
             </w:r>
           </w:p>
           <w:p>
@@ -4882,7 +5362,27 @@
                 <w:color w:val="000000"/>
                 <w:sz w:val="24"/>
               </w:rPr>
-              <w:t>with FM PPS 01 as appropriate on information flow regarding weather condition.</w:t>
+              <w:t xml:space="preserve">with FM PPS 01 as appropriate on information flow regarding weather </w:t>
+            </w:r>
+            <w:proofErr w:type="gramStart"/>
+            <w:r>
+              <w:rPr>
+                <w:rFonts w:ascii="Times New Roman"/>
+                <w:bCs/>
+                <w:color w:val="000000"/>
+                <w:sz w:val="24"/>
+              </w:rPr>
+              <w:t>condition</w:t>
+            </w:r>
+            <w:proofErr w:type="gramEnd"/>
+            <w:r>
+              <w:rPr>
+                <w:rFonts w:ascii="Times New Roman"/>
+                <w:bCs/>
+                <w:color w:val="000000"/>
+                <w:sz w:val="24"/>
+              </w:rPr>
+              <w:t>.</w:t>
             </w:r>
           </w:p>
           <w:p>
@@ -4913,7 +5413,27 @@
                 <w:color w:val="000000"/>
                 <w:sz w:val="24"/>
               </w:rPr>
-              <w:t>Liaise with HSSE Manager with regard to this Procedure.</w:t>
+              <w:t xml:space="preserve">Liaise with HSSE Manager </w:t>
+            </w:r>
+            <w:proofErr w:type="gramStart"/>
+            <w:r>
+              <w:rPr>
+                <w:rFonts w:ascii="Times New Roman"/>
+                <w:bCs/>
+                <w:color w:val="000000"/>
+                <w:sz w:val="24"/>
+              </w:rPr>
+              <w:t>with regard to</w:t>
+            </w:r>
+            <w:proofErr w:type="gramEnd"/>
+            <w:r>
+              <w:rPr>
+                <w:rFonts w:ascii="Times New Roman"/>
+                <w:bCs/>
+                <w:color w:val="000000"/>
+                <w:sz w:val="24"/>
+              </w:rPr>
+              <w:t xml:space="preserve"> this Procedure.</w:t>
             </w:r>
           </w:p>
           <w:p>
@@ -5270,7 +5790,27 @@
                 <w:color w:val="000000"/>
                 <w:sz w:val="24"/>
               </w:rPr>
-              <w:t>Ready to sail “In Port” of a spot chartered supply vessel if any.</w:t>
+              <w:t xml:space="preserve">Ready to sail “In Port” of a </w:t>
+            </w:r>
+            <w:proofErr w:type="gramStart"/>
+            <w:r>
+              <w:rPr>
+                <w:rFonts w:ascii="Times New Roman"/>
+                <w:bCs/>
+                <w:color w:val="000000"/>
+                <w:sz w:val="24"/>
+              </w:rPr>
+              <w:t>spot chartered</w:t>
+            </w:r>
+            <w:proofErr w:type="gramEnd"/>
+            <w:r>
+              <w:rPr>
+                <w:rFonts w:ascii="Times New Roman"/>
+                <w:bCs/>
+                <w:color w:val="000000"/>
+                <w:sz w:val="24"/>
+              </w:rPr>
+              <w:t xml:space="preserve"> supply vessel if any.</w:t>
             </w:r>
           </w:p>
           <w:p>
@@ -5449,7 +5989,27 @@
                 <w:color w:val="000000"/>
                 <w:sz w:val="24"/>
               </w:rPr>
-              <w:t>Identify a safe location and method of transport for the evacuation of all personnel.</w:t>
+              <w:t xml:space="preserve">Identify </w:t>
+            </w:r>
+            <w:proofErr w:type="gramStart"/>
+            <w:r>
+              <w:rPr>
+                <w:rFonts w:ascii="Times New Roman"/>
+                <w:bCs/>
+                <w:color w:val="000000"/>
+                <w:sz w:val="24"/>
+              </w:rPr>
+              <w:t>a safe</w:t>
+            </w:r>
+            <w:proofErr w:type="gramEnd"/>
+            <w:r>
+              <w:rPr>
+                <w:rFonts w:ascii="Times New Roman"/>
+                <w:bCs/>
+                <w:color w:val="000000"/>
+                <w:sz w:val="24"/>
+              </w:rPr>
+              <w:t xml:space="preserve"> location and method of transport for the evacuation of all personnel.</w:t>
             </w:r>
           </w:p>
           <w:p>
@@ -5541,6 +6101,7 @@
                 <w:color w:val="000000"/>
                 <w:sz w:val="24"/>
               </w:rPr>
+              <w:lastRenderedPageBreak/>
               <w:t>Telecom Technician</w:t>
             </w:r>
           </w:p>
@@ -5769,7 +6330,27 @@
                 <w:color w:val="000000"/>
                 <w:sz w:val="24"/>
               </w:rPr>
-              <w:t>Ensure medical supplies and stretcher is kept in a state of readiness.</w:t>
+              <w:t xml:space="preserve">Ensure medical supplies and </w:t>
+            </w:r>
+            <w:proofErr w:type="gramStart"/>
+            <w:r>
+              <w:rPr>
+                <w:rFonts w:ascii="Times New Roman"/>
+                <w:bCs/>
+                <w:color w:val="000000"/>
+                <w:sz w:val="24"/>
+              </w:rPr>
+              <w:t>stretcher is</w:t>
+            </w:r>
+            <w:proofErr w:type="gramEnd"/>
+            <w:r>
+              <w:rPr>
+                <w:rFonts w:ascii="Times New Roman"/>
+                <w:bCs/>
+                <w:color w:val="000000"/>
+                <w:sz w:val="24"/>
+              </w:rPr>
+              <w:t xml:space="preserve"> kept in a state of readiness.</w:t>
             </w:r>
           </w:p>
           <w:p>
@@ -6085,7 +6666,27 @@
                 <w:color w:val="000000"/>
                 <w:sz w:val="24"/>
               </w:rPr>
-              <w:t>Appoint an IMT member to identify and reserve helicopter and road transport requirement.</w:t>
+              <w:t xml:space="preserve">Appoint an IMT member to identify and reserve helicopter and road transport </w:t>
+            </w:r>
+            <w:proofErr w:type="gramStart"/>
+            <w:r>
+              <w:rPr>
+                <w:rFonts w:ascii="Times New Roman"/>
+                <w:bCs/>
+                <w:color w:val="000000"/>
+                <w:sz w:val="24"/>
+              </w:rPr>
+              <w:t>requirement</w:t>
+            </w:r>
+            <w:proofErr w:type="gramEnd"/>
+            <w:r>
+              <w:rPr>
+                <w:rFonts w:ascii="Times New Roman"/>
+                <w:bCs/>
+                <w:color w:val="000000"/>
+                <w:sz w:val="24"/>
+              </w:rPr>
+              <w:t>.</w:t>
             </w:r>
           </w:p>
           <w:p>
@@ -6178,7 +6779,27 @@
                 <w:color w:val="000000"/>
                 <w:sz w:val="24"/>
               </w:rPr>
-              <w:t>Regularly contact with the OIM/FM for up-to-date information.</w:t>
+              <w:t xml:space="preserve">Regularly </w:t>
+            </w:r>
+            <w:proofErr w:type="gramStart"/>
+            <w:r>
+              <w:rPr>
+                <w:rFonts w:ascii="Times New Roman"/>
+                <w:bCs/>
+                <w:color w:val="000000"/>
+                <w:sz w:val="24"/>
+              </w:rPr>
+              <w:t>contact with</w:t>
+            </w:r>
+            <w:proofErr w:type="gramEnd"/>
+            <w:r>
+              <w:rPr>
+                <w:rFonts w:ascii="Times New Roman"/>
+                <w:bCs/>
+                <w:color w:val="000000"/>
+                <w:sz w:val="24"/>
+              </w:rPr>
+              <w:t xml:space="preserve"> the OIM/FM for up-to-date information.</w:t>
             </w:r>
           </w:p>
         </w:tc>
@@ -6219,14 +6840,25 @@
               </w:rPr>
               <w:t>S</w:t>
             </w:r>
-            <w:r>
-              <w:rPr>
-                <w:rFonts w:ascii="Times New Roman"/>
-                <w:bCs/>
-                <w:color w:val="000000"/>
-                <w:sz w:val="24"/>
-              </w:rPr>
-              <w:t xml:space="preserve">upply </w:t>
+            <w:proofErr w:type="spellStart"/>
+            <w:r>
+              <w:rPr>
+                <w:rFonts w:ascii="Times New Roman"/>
+                <w:bCs/>
+                <w:color w:val="000000"/>
+                <w:sz w:val="24"/>
+              </w:rPr>
+              <w:t>upply</w:t>
+            </w:r>
+            <w:proofErr w:type="spellEnd"/>
+            <w:r>
+              <w:rPr>
+                <w:rFonts w:ascii="Times New Roman"/>
+                <w:bCs/>
+                <w:color w:val="000000"/>
+                <w:sz w:val="24"/>
+              </w:rPr>
+              <w:t xml:space="preserve"> </w:t>
             </w:r>
             <w:r>
               <w:rPr>
@@ -6238,14 +6870,25 @@
               </w:rPr>
               <w:t>B</w:t>
             </w:r>
-            <w:r>
-              <w:rPr>
-                <w:rFonts w:ascii="Times New Roman"/>
-                <w:bCs/>
-                <w:color w:val="000000"/>
-                <w:sz w:val="24"/>
-              </w:rPr>
-              <w:t xml:space="preserve">ase </w:t>
+            <w:proofErr w:type="spellStart"/>
+            <w:r>
+              <w:rPr>
+                <w:rFonts w:ascii="Times New Roman"/>
+                <w:bCs/>
+                <w:color w:val="000000"/>
+                <w:sz w:val="24"/>
+              </w:rPr>
+              <w:t>ase</w:t>
+            </w:r>
+            <w:proofErr w:type="spellEnd"/>
+            <w:r>
+              <w:rPr>
+                <w:rFonts w:ascii="Times New Roman"/>
+                <w:bCs/>
+                <w:color w:val="000000"/>
+                <w:sz w:val="24"/>
+              </w:rPr>
+              <w:t xml:space="preserve"> </w:t>
             </w:r>
             <w:r>
               <w:rPr>
@@ -6290,7 +6933,27 @@
                 <w:color w:val="000000"/>
                 <w:sz w:val="24"/>
               </w:rPr>
-              <w:t>In consultation with the DIM prepare a logistic plan for the evacuation of PUQC and PPS 01.</w:t>
+              <w:t xml:space="preserve">In consultation with the </w:t>
+            </w:r>
+            <w:proofErr w:type="gramStart"/>
+            <w:r>
+              <w:rPr>
+                <w:rFonts w:ascii="Times New Roman"/>
+                <w:bCs/>
+                <w:color w:val="000000"/>
+                <w:sz w:val="24"/>
+              </w:rPr>
+              <w:t>DIM</w:t>
+            </w:r>
+            <w:proofErr w:type="gramEnd"/>
+            <w:r>
+              <w:rPr>
+                <w:rFonts w:ascii="Times New Roman"/>
+                <w:bCs/>
+                <w:color w:val="000000"/>
+                <w:sz w:val="24"/>
+              </w:rPr>
+              <w:t xml:space="preserve"> prepare a logistic plan for the evacuation of PUQC and PPS 01.</w:t>
             </w:r>
           </w:p>
           <w:p>
@@ -6352,7 +7015,27 @@
                 <w:color w:val="000000"/>
                 <w:sz w:val="24"/>
               </w:rPr>
-              <w:t>Obtain last POB list and check names of persons as they arrive at arrival point.</w:t>
+              <w:t xml:space="preserve">Obtain last POB list and check names of </w:t>
+            </w:r>
+            <w:proofErr w:type="gramStart"/>
+            <w:r>
+              <w:rPr>
+                <w:rFonts w:ascii="Times New Roman"/>
+                <w:bCs/>
+                <w:color w:val="000000"/>
+                <w:sz w:val="24"/>
+              </w:rPr>
+              <w:t>persons</w:t>
+            </w:r>
+            <w:proofErr w:type="gramEnd"/>
+            <w:r>
+              <w:rPr>
+                <w:rFonts w:ascii="Times New Roman"/>
+                <w:bCs/>
+                <w:color w:val="000000"/>
+                <w:sz w:val="24"/>
+              </w:rPr>
+              <w:t xml:space="preserve"> as they arrive at arrival point.</w:t>
             </w:r>
           </w:p>
           <w:p>
@@ -6414,7 +7097,27 @@
                 <w:color w:val="000000"/>
                 <w:sz w:val="24"/>
               </w:rPr>
-              <w:t>Liaise with contractors employers to keep them informed on latest situation.</w:t>
+              <w:t xml:space="preserve">Liaise with </w:t>
+            </w:r>
+            <w:proofErr w:type="gramStart"/>
+            <w:r>
+              <w:rPr>
+                <w:rFonts w:ascii="Times New Roman"/>
+                <w:bCs/>
+                <w:color w:val="000000"/>
+                <w:sz w:val="24"/>
+              </w:rPr>
+              <w:t>contractors</w:t>
+            </w:r>
+            <w:proofErr w:type="gramEnd"/>
+            <w:r>
+              <w:rPr>
+                <w:rFonts w:ascii="Times New Roman"/>
+                <w:bCs/>
+                <w:color w:val="000000"/>
+                <w:sz w:val="24"/>
+              </w:rPr>
+              <w:t xml:space="preserve"> employers to keep them informed on latest situation.</w:t>
             </w:r>
           </w:p>
           <w:p>
@@ -6495,7 +7198,27 @@
                 <w:color w:val="000000"/>
                 <w:sz w:val="24"/>
               </w:rPr>
-              <w:t>Check their work place and secure any loose items.</w:t>
+              <w:t xml:space="preserve">Check their </w:t>
+            </w:r>
+            <w:proofErr w:type="gramStart"/>
+            <w:r>
+              <w:rPr>
+                <w:rFonts w:ascii="Times New Roman"/>
+                <w:bCs/>
+                <w:color w:val="000000"/>
+                <w:sz w:val="24"/>
+              </w:rPr>
+              <w:t>work place</w:t>
+            </w:r>
+            <w:proofErr w:type="gramEnd"/>
+            <w:r>
+              <w:rPr>
+                <w:rFonts w:ascii="Times New Roman"/>
+                <w:bCs/>
+                <w:color w:val="000000"/>
+                <w:sz w:val="24"/>
+              </w:rPr>
+              <w:t xml:space="preserve"> and secure any loose items.</w:t>
             </w:r>
           </w:p>
           <w:p>
@@ -6613,7 +7336,27 @@
           <w:color w:val="000000"/>
           <w:sz w:val="24"/>
         </w:rPr>
-        <w:t xml:space="preserve">A ‘YELLOW ALERT’ signal shall be declared when the path and strength of a typhoon has its center located within the calculated yellow alert radius or between 750nm to 240nm of Rong Doi and </w:t>
+        <w:t xml:space="preserve">A ‘YELLOW ALERT’ signal shall be declared when the path and strength of a typhoon </w:t>
+      </w:r>
+      <w:proofErr w:type="gramStart"/>
+      <w:r>
+        <w:rPr>
+          <w:rFonts w:ascii="Times New Roman"/>
+          <w:bCs/>
+          <w:color w:val="000000"/>
+          <w:sz w:val="24"/>
+        </w:rPr>
+        <w:t>has</w:t>
+      </w:r>
+      <w:proofErr w:type="gramEnd"/>
+      <w:r>
+        <w:rPr>
+          <w:rFonts w:ascii="Times New Roman"/>
+          <w:bCs/>
+          <w:color w:val="000000"/>
+          <w:sz w:val="24"/>
+        </w:rPr>
+        <w:t xml:space="preserve"> its center located within the calculated yellow alert radius or between 750nm to 240nm of Rong Doi and </w:t>
       </w:r>
       <w:r>
         <w:rPr>
@@ -7291,7 +8034,27 @@
                 <w:color w:val="000000"/>
                 <w:sz w:val="24"/>
               </w:rPr>
-              <w:t>Instruct ERT member to secure operations and commence securing loose equipment.</w:t>
+              <w:t xml:space="preserve">Instruct ERT </w:t>
+            </w:r>
+            <w:proofErr w:type="gramStart"/>
+            <w:r>
+              <w:rPr>
+                <w:rFonts w:ascii="Times New Roman"/>
+                <w:bCs/>
+                <w:color w:val="000000"/>
+                <w:sz w:val="24"/>
+              </w:rPr>
+              <w:t>member</w:t>
+            </w:r>
+            <w:proofErr w:type="gramEnd"/>
+            <w:r>
+              <w:rPr>
+                <w:rFonts w:ascii="Times New Roman"/>
+                <w:bCs/>
+                <w:color w:val="000000"/>
+                <w:sz w:val="24"/>
+              </w:rPr>
+              <w:t xml:space="preserve"> to secure operations and commence securing loose equipment.</w:t>
             </w:r>
           </w:p>
           <w:p>
@@ -7353,7 +8116,27 @@
                 <w:color w:val="000000"/>
                 <w:sz w:val="24"/>
               </w:rPr>
-              <w:t>Confirm accommodation in the safe place is made ready to receive evacuees.</w:t>
+              <w:t xml:space="preserve">Confirm accommodation in </w:t>
+            </w:r>
+            <w:proofErr w:type="gramStart"/>
+            <w:r>
+              <w:rPr>
+                <w:rFonts w:ascii="Times New Roman"/>
+                <w:bCs/>
+                <w:color w:val="000000"/>
+                <w:sz w:val="24"/>
+              </w:rPr>
+              <w:t>the</w:t>
+            </w:r>
+            <w:proofErr w:type="gramEnd"/>
+            <w:r>
+              <w:rPr>
+                <w:rFonts w:ascii="Times New Roman"/>
+                <w:bCs/>
+                <w:color w:val="000000"/>
+                <w:sz w:val="24"/>
+              </w:rPr>
+              <w:t xml:space="preserve"> safe place is made ready to receive evacuees.</w:t>
             </w:r>
           </w:p>
           <w:p>
@@ -7384,7 +8167,27 @@
                 <w:color w:val="000000"/>
                 <w:sz w:val="24"/>
               </w:rPr>
-              <w:t>Continue to track and take care of evacuees until returned to place of work or home.</w:t>
+              <w:t xml:space="preserve">Continue to track and take care of evacuees until </w:t>
+            </w:r>
+            <w:proofErr w:type="gramStart"/>
+            <w:r>
+              <w:rPr>
+                <w:rFonts w:ascii="Times New Roman"/>
+                <w:bCs/>
+                <w:color w:val="000000"/>
+                <w:sz w:val="24"/>
+              </w:rPr>
+              <w:t>returned</w:t>
+            </w:r>
+            <w:proofErr w:type="gramEnd"/>
+            <w:r>
+              <w:rPr>
+                <w:rFonts w:ascii="Times New Roman"/>
+                <w:bCs/>
+                <w:color w:val="000000"/>
+                <w:sz w:val="24"/>
+              </w:rPr>
+              <w:t xml:space="preserve"> to place of work or home.</w:t>
             </w:r>
           </w:p>
           <w:p>
@@ -7532,7 +8335,27 @@
                 <w:sz w:val="24"/>
               </w:rPr>
               <w:lastRenderedPageBreak/>
-              <w:t>on a 2 hourly and report to OIM/FM.</w:t>
+              <w:t xml:space="preserve">on a 2 </w:t>
+            </w:r>
+            <w:proofErr w:type="gramStart"/>
+            <w:r>
+              <w:rPr>
+                <w:rFonts w:ascii="Times New Roman"/>
+                <w:bCs/>
+                <w:color w:val="000000"/>
+                <w:sz w:val="24"/>
+              </w:rPr>
+              <w:t>hourly</w:t>
+            </w:r>
+            <w:proofErr w:type="gramEnd"/>
+            <w:r>
+              <w:rPr>
+                <w:rFonts w:ascii="Times New Roman"/>
+                <w:bCs/>
+                <w:color w:val="000000"/>
+                <w:sz w:val="24"/>
+              </w:rPr>
+              <w:t xml:space="preserve"> and report to OIM/FM.</w:t>
             </w:r>
           </w:p>
           <w:p>
@@ -7852,7 +8675,27 @@
                 <w:color w:val="000000"/>
                 <w:sz w:val="24"/>
               </w:rPr>
-              <w:t>Instruct appointed person to inform all relevant Government Agencies.</w:t>
+              <w:t xml:space="preserve">Instruct </w:t>
+            </w:r>
+            <w:proofErr w:type="gramStart"/>
+            <w:r>
+              <w:rPr>
+                <w:rFonts w:ascii="Times New Roman"/>
+                <w:bCs/>
+                <w:color w:val="000000"/>
+                <w:sz w:val="24"/>
+              </w:rPr>
+              <w:t>appointed person</w:t>
+            </w:r>
+            <w:proofErr w:type="gramEnd"/>
+            <w:r>
+              <w:rPr>
+                <w:rFonts w:ascii="Times New Roman"/>
+                <w:bCs/>
+                <w:color w:val="000000"/>
+                <w:sz w:val="24"/>
+              </w:rPr>
+              <w:t xml:space="preserve"> to inform all relevant Government Agencies.</w:t>
             </w:r>
           </w:p>
           <w:p>
@@ -7924,15 +8767,27 @@
               </w:rPr>
               <w:t>S</w:t>
             </w:r>
-            <w:r>
-              <w:rPr>
-                <w:rFonts w:ascii="Times New Roman"/>
-                <w:bCs/>
-                <w:color w:val="000000"/>
-                <w:sz w:val="24"/>
-              </w:rPr>
-              <w:t xml:space="preserve">upply </w:t>
-            </w:r>
+            <w:proofErr w:type="spellStart"/>
+            <w:r>
+              <w:rPr>
+                <w:rFonts w:ascii="Times New Roman"/>
+                <w:bCs/>
+                <w:color w:val="000000"/>
+                <w:sz w:val="24"/>
+              </w:rPr>
+              <w:t>upply</w:t>
+            </w:r>
+            <w:proofErr w:type="spellEnd"/>
+            <w:r>
+              <w:rPr>
+                <w:rFonts w:ascii="Times New Roman"/>
+                <w:bCs/>
+                <w:color w:val="000000"/>
+                <w:sz w:val="24"/>
+              </w:rPr>
+              <w:t xml:space="preserve"> </w:t>
+            </w:r>
+            <w:proofErr w:type="gramStart"/>
             <w:r>
               <w:rPr>
                 <w:rFonts w:ascii="Times New Roman"/>
@@ -7943,14 +8798,35 @@
               </w:rPr>
               <w:t>B</w:t>
             </w:r>
-            <w:r>
-              <w:rPr>
-                <w:rFonts w:ascii="Times New Roman"/>
-                <w:bCs/>
-                <w:color w:val="000000"/>
-                <w:sz w:val="24"/>
-              </w:rPr>
-              <w:t>ase  Logistics Officer</w:t>
+            <w:proofErr w:type="spellStart"/>
+            <w:r>
+              <w:rPr>
+                <w:rFonts w:ascii="Times New Roman"/>
+                <w:bCs/>
+                <w:color w:val="000000"/>
+                <w:sz w:val="24"/>
+              </w:rPr>
+              <w:t>ase</w:t>
+            </w:r>
+            <w:proofErr w:type="spellEnd"/>
+            <w:r>
+              <w:rPr>
+                <w:rFonts w:ascii="Times New Roman"/>
+                <w:bCs/>
+                <w:color w:val="000000"/>
+                <w:sz w:val="24"/>
+              </w:rPr>
+              <w:t xml:space="preserve">  Logistics</w:t>
+            </w:r>
+            <w:proofErr w:type="gramEnd"/>
+            <w:r>
+              <w:rPr>
+                <w:rFonts w:ascii="Times New Roman"/>
+                <w:bCs/>
+                <w:color w:val="000000"/>
+                <w:sz w:val="24"/>
+              </w:rPr>
+              <w:t xml:space="preserve"> Officer</w:t>
             </w:r>
           </w:p>
         </w:tc>
@@ -8079,7 +8955,27 @@
                 <w:color w:val="000000"/>
                 <w:sz w:val="24"/>
               </w:rPr>
-              <w:t>Confirm accommodations, transportation and refreshment for evacuees.</w:t>
+              <w:t xml:space="preserve">Confirm </w:t>
+            </w:r>
+            <w:proofErr w:type="gramStart"/>
+            <w:r>
+              <w:rPr>
+                <w:rFonts w:ascii="Times New Roman"/>
+                <w:bCs/>
+                <w:color w:val="000000"/>
+                <w:sz w:val="24"/>
+              </w:rPr>
+              <w:t>accommodations</w:t>
+            </w:r>
+            <w:proofErr w:type="gramEnd"/>
+            <w:r>
+              <w:rPr>
+                <w:rFonts w:ascii="Times New Roman"/>
+                <w:bCs/>
+                <w:color w:val="000000"/>
+                <w:sz w:val="24"/>
+              </w:rPr>
+              <w:t>, transportation and refreshment for evacuees.</w:t>
             </w:r>
           </w:p>
         </w:tc>
@@ -8144,7 +9040,27 @@
                 <w:color w:val="000000"/>
                 <w:sz w:val="24"/>
               </w:rPr>
-              <w:t>Follow instruction as directed by OIM/FM and OSC.</w:t>
+              <w:t xml:space="preserve">Follow </w:t>
+            </w:r>
+            <w:proofErr w:type="gramStart"/>
+            <w:r>
+              <w:rPr>
+                <w:rFonts w:ascii="Times New Roman"/>
+                <w:bCs/>
+                <w:color w:val="000000"/>
+                <w:sz w:val="24"/>
+              </w:rPr>
+              <w:t>instruction</w:t>
+            </w:r>
+            <w:proofErr w:type="gramEnd"/>
+            <w:r>
+              <w:rPr>
+                <w:rFonts w:ascii="Times New Roman"/>
+                <w:bCs/>
+                <w:color w:val="000000"/>
+                <w:sz w:val="24"/>
+              </w:rPr>
+              <w:t xml:space="preserve"> as directed by OIM/FM and OSC.</w:t>
             </w:r>
           </w:p>
           <w:p>
@@ -8226,7 +9142,27 @@
                 <w:color w:val="000000"/>
                 <w:sz w:val="24"/>
               </w:rPr>
-              <w:t>Check work place and secure all loose items.</w:t>
+              <w:t xml:space="preserve">Check </w:t>
+            </w:r>
+            <w:proofErr w:type="gramStart"/>
+            <w:r>
+              <w:rPr>
+                <w:rFonts w:ascii="Times New Roman"/>
+                <w:bCs/>
+                <w:color w:val="000000"/>
+                <w:sz w:val="24"/>
+              </w:rPr>
+              <w:t>work place</w:t>
+            </w:r>
+            <w:proofErr w:type="gramEnd"/>
+            <w:r>
+              <w:rPr>
+                <w:rFonts w:ascii="Times New Roman"/>
+                <w:bCs/>
+                <w:color w:val="000000"/>
+                <w:sz w:val="24"/>
+              </w:rPr>
+              <w:t xml:space="preserve"> and secure all loose items.</w:t>
             </w:r>
           </w:p>
           <w:p>
@@ -8315,7 +9251,27 @@
           <w:color w:val="000000"/>
           <w:sz w:val="24"/>
         </w:rPr>
-        <w:t xml:space="preserve">A ‘RED ALERT’ signal will be issued when the path and strength of typhoon has its centers located within the calculated red alert radius or 240nm of the Rong Doi and </w:t>
+        <w:t xml:space="preserve">A ‘RED ALERT’ signal will be issued when the path and strength of typhoon </w:t>
+      </w:r>
+      <w:proofErr w:type="gramStart"/>
+      <w:r>
+        <w:rPr>
+          <w:rFonts w:ascii="Times New Roman"/>
+          <w:bCs/>
+          <w:color w:val="000000"/>
+          <w:sz w:val="24"/>
+        </w:rPr>
+        <w:t>has</w:t>
+      </w:r>
+      <w:proofErr w:type="gramEnd"/>
+      <w:r>
+        <w:rPr>
+          <w:rFonts w:ascii="Times New Roman"/>
+          <w:bCs/>
+          <w:color w:val="000000"/>
+          <w:sz w:val="24"/>
+        </w:rPr>
+        <w:t xml:space="preserve"> its centers located within the calculated red alert radius or 240nm of the Rong Doi and </w:t>
       </w:r>
       <w:r>
         <w:rPr>
@@ -8725,7 +9681,27 @@
                 <w:color w:val="000000"/>
                 <w:sz w:val="24"/>
               </w:rPr>
-              <w:t xml:space="preserve"> and advice of evacuation progress.</w:t>
+              <w:t xml:space="preserve"> and advice </w:t>
+            </w:r>
+            <w:proofErr w:type="gramStart"/>
+            <w:r>
+              <w:rPr>
+                <w:rFonts w:ascii="Times New Roman"/>
+                <w:bCs/>
+                <w:color w:val="000000"/>
+                <w:sz w:val="24"/>
+              </w:rPr>
+              <w:t>of</w:t>
+            </w:r>
+            <w:proofErr w:type="gramEnd"/>
+            <w:r>
+              <w:rPr>
+                <w:rFonts w:ascii="Times New Roman"/>
+                <w:bCs/>
+                <w:color w:val="000000"/>
+                <w:sz w:val="24"/>
+              </w:rPr>
+              <w:t xml:space="preserve"> evacuation progress.</w:t>
             </w:r>
           </w:p>
         </w:tc>
@@ -8754,6 +9730,7 @@
                 <w:color w:val="000000"/>
                 <w:sz w:val="24"/>
               </w:rPr>
+              <w:lastRenderedPageBreak/>
               <w:t>OSC/</w:t>
             </w:r>
           </w:p>
@@ -8935,7 +9912,27 @@
                 <w:color w:val="000000"/>
                 <w:sz w:val="24"/>
               </w:rPr>
-              <w:t>Inform and brief OIM/FM on latest issue and activities.</w:t>
+              <w:t xml:space="preserve">Inform and brief OIM/FM on latest </w:t>
+            </w:r>
+            <w:proofErr w:type="gramStart"/>
+            <w:r>
+              <w:rPr>
+                <w:rFonts w:ascii="Times New Roman"/>
+                <w:bCs/>
+                <w:color w:val="000000"/>
+                <w:sz w:val="24"/>
+              </w:rPr>
+              <w:t>issue</w:t>
+            </w:r>
+            <w:proofErr w:type="gramEnd"/>
+            <w:r>
+              <w:rPr>
+                <w:rFonts w:ascii="Times New Roman"/>
+                <w:bCs/>
+                <w:color w:val="000000"/>
+                <w:sz w:val="24"/>
+              </w:rPr>
+              <w:t xml:space="preserve"> and activities.</w:t>
             </w:r>
           </w:p>
         </w:tc>
@@ -9000,7 +9997,27 @@
                 <w:color w:val="000000"/>
                 <w:sz w:val="24"/>
               </w:rPr>
-              <w:t>Monitor typhoon path and strength-record weather conditions on a 1 hourly and report to OIM/FM.</w:t>
+              <w:t xml:space="preserve">Monitor typhoon path and strength-record weather conditions on a 1 </w:t>
+            </w:r>
+            <w:proofErr w:type="gramStart"/>
+            <w:r>
+              <w:rPr>
+                <w:rFonts w:ascii="Times New Roman"/>
+                <w:bCs/>
+                <w:color w:val="000000"/>
+                <w:sz w:val="24"/>
+              </w:rPr>
+              <w:t>hourly</w:t>
+            </w:r>
+            <w:proofErr w:type="gramEnd"/>
+            <w:r>
+              <w:rPr>
+                <w:rFonts w:ascii="Times New Roman"/>
+                <w:bCs/>
+                <w:color w:val="000000"/>
+                <w:sz w:val="24"/>
+              </w:rPr>
+              <w:t xml:space="preserve"> and report to OIM/FM.</w:t>
             </w:r>
           </w:p>
           <w:p>
@@ -9494,7 +10511,27 @@
                 <w:color w:val="000000"/>
                 <w:sz w:val="24"/>
               </w:rPr>
-              <w:t>Instruct appointed person to inform all relevant Government Agencies.</w:t>
+              <w:t xml:space="preserve">Instruct </w:t>
+            </w:r>
+            <w:proofErr w:type="gramStart"/>
+            <w:r>
+              <w:rPr>
+                <w:rFonts w:ascii="Times New Roman"/>
+                <w:bCs/>
+                <w:color w:val="000000"/>
+                <w:sz w:val="24"/>
+              </w:rPr>
+              <w:t>appointed person</w:t>
+            </w:r>
+            <w:proofErr w:type="gramEnd"/>
+            <w:r>
+              <w:rPr>
+                <w:rFonts w:ascii="Times New Roman"/>
+                <w:bCs/>
+                <w:color w:val="000000"/>
+                <w:sz w:val="24"/>
+              </w:rPr>
+              <w:t xml:space="preserve"> to inform all relevant Government Agencies.</w:t>
             </w:r>
           </w:p>
           <w:p>
@@ -9634,14 +10671,25 @@
               </w:rPr>
               <w:t>S</w:t>
             </w:r>
-            <w:r>
-              <w:rPr>
-                <w:rFonts w:ascii="Times New Roman"/>
-                <w:bCs/>
-                <w:color w:val="000000"/>
-                <w:sz w:val="24"/>
-              </w:rPr>
-              <w:t xml:space="preserve">upply </w:t>
+            <w:proofErr w:type="spellStart"/>
+            <w:r>
+              <w:rPr>
+                <w:rFonts w:ascii="Times New Roman"/>
+                <w:bCs/>
+                <w:color w:val="000000"/>
+                <w:sz w:val="24"/>
+              </w:rPr>
+              <w:t>upply</w:t>
+            </w:r>
+            <w:proofErr w:type="spellEnd"/>
+            <w:r>
+              <w:rPr>
+                <w:rFonts w:ascii="Times New Roman"/>
+                <w:bCs/>
+                <w:color w:val="000000"/>
+                <w:sz w:val="24"/>
+              </w:rPr>
+              <w:t xml:space="preserve"> </w:t>
             </w:r>
             <w:r>
               <w:rPr>
@@ -9653,14 +10701,25 @@
               </w:rPr>
               <w:t>B</w:t>
             </w:r>
-            <w:r>
-              <w:rPr>
-                <w:rFonts w:ascii="Times New Roman"/>
-                <w:bCs/>
-                <w:color w:val="000000"/>
-                <w:sz w:val="24"/>
-              </w:rPr>
-              <w:t xml:space="preserve">ase </w:t>
+            <w:proofErr w:type="spellStart"/>
+            <w:r>
+              <w:rPr>
+                <w:rFonts w:ascii="Times New Roman"/>
+                <w:bCs/>
+                <w:color w:val="000000"/>
+                <w:sz w:val="24"/>
+              </w:rPr>
+              <w:t>ase</w:t>
+            </w:r>
+            <w:proofErr w:type="spellEnd"/>
+            <w:r>
+              <w:rPr>
+                <w:rFonts w:ascii="Times New Roman"/>
+                <w:bCs/>
+                <w:color w:val="000000"/>
+                <w:sz w:val="24"/>
+              </w:rPr>
+              <w:t xml:space="preserve"> </w:t>
             </w:r>
             <w:r>
               <w:rPr>
@@ -9843,14 +10902,25 @@
                 <w:sz w:val="24"/>
               </w:rPr>
             </w:pPr>
-            <w:r>
-              <w:rPr>
-                <w:rFonts w:ascii="Times New Roman"/>
-                <w:bCs/>
-                <w:color w:val="000000"/>
-                <w:sz w:val="24"/>
-              </w:rPr>
-              <w:t>Prepare to SD facilities as directed by OIM/FM.</w:t>
+            <w:proofErr w:type="gramStart"/>
+            <w:r>
+              <w:rPr>
+                <w:rFonts w:ascii="Times New Roman"/>
+                <w:bCs/>
+                <w:color w:val="000000"/>
+                <w:sz w:val="24"/>
+              </w:rPr>
+              <w:t>Prepare to</w:t>
+            </w:r>
+            <w:proofErr w:type="gramEnd"/>
+            <w:r>
+              <w:rPr>
+                <w:rFonts w:ascii="Times New Roman"/>
+                <w:bCs/>
+                <w:color w:val="000000"/>
+                <w:sz w:val="24"/>
+              </w:rPr>
+              <w:t xml:space="preserve"> SD facilities as directed by OIM/FM.</w:t>
             </w:r>
           </w:p>
           <w:p>
@@ -9995,7 +11065,23 @@
           <w:rFonts w:ascii="Times New Roman"/>
           <w:sz w:val="24"/>
         </w:rPr>
-        <w:t>One helicopter shall be on standby to take off at any times.</w:t>
+        <w:t xml:space="preserve">One helicopter shall be on standby to take off at any </w:t>
+      </w:r>
+      <w:proofErr w:type="gramStart"/>
+      <w:r>
+        <w:rPr>
+          <w:rFonts w:ascii="Times New Roman"/>
+          <w:sz w:val="24"/>
+        </w:rPr>
+        <w:t>times</w:t>
+      </w:r>
+      <w:proofErr w:type="gramEnd"/>
+      <w:r>
+        <w:rPr>
+          <w:rFonts w:ascii="Times New Roman"/>
+          <w:sz w:val="24"/>
+        </w:rPr>
+        <w:t>.</w:t>
       </w:r>
     </w:p>
     <w:p>
@@ -10112,7 +11198,23 @@
           <w:rFonts w:ascii="Times New Roman"/>
           <w:sz w:val="24"/>
         </w:rPr>
-        <w:t>Evacuation by Standby Vessel or Supply Vessel to be taken if evacuation by helicopter is not feasible.</w:t>
+        <w:t xml:space="preserve">Evacuation by Standby Vessel or Supply Vessel </w:t>
+      </w:r>
+      <w:proofErr w:type="gramStart"/>
+      <w:r>
+        <w:rPr>
+          <w:rFonts w:ascii="Times New Roman"/>
+          <w:sz w:val="24"/>
+        </w:rPr>
+        <w:t>to</w:t>
+      </w:r>
+      <w:proofErr w:type="gramEnd"/>
+      <w:r>
+        <w:rPr>
+          <w:rFonts w:ascii="Times New Roman"/>
+          <w:sz w:val="24"/>
+        </w:rPr>
+        <w:t xml:space="preserve"> be taken if evacuation by helicopter is not feasible.</w:t>
       </w:r>
     </w:p>
     <w:p>
@@ -10196,7 +11298,23 @@
           <w:rFonts w:ascii="Times New Roman"/>
           <w:sz w:val="24"/>
         </w:rPr>
-        <w:t>All Supply Vessels arriving at the fields during typhoon season shall offload cargo as soon as possible, in order to clear deck for evacuation task if necessary.</w:t>
+        <w:t xml:space="preserve">All Supply Vessels arriving at the fields during typhoon season shall offload cargo as soon as possible, </w:t>
+      </w:r>
+      <w:proofErr w:type="gramStart"/>
+      <w:r>
+        <w:rPr>
+          <w:rFonts w:ascii="Times New Roman"/>
+          <w:sz w:val="24"/>
+        </w:rPr>
+        <w:t>in order to</w:t>
+      </w:r>
+      <w:proofErr w:type="gramEnd"/>
+      <w:r>
+        <w:rPr>
+          <w:rFonts w:ascii="Times New Roman"/>
+          <w:sz w:val="24"/>
+        </w:rPr>
+        <w:t xml:space="preserve"> clear deck for evacuation task if necessary.</w:t>
       </w:r>
     </w:p>
     <w:p>
@@ -10280,7 +11398,23 @@
           <w:rFonts w:ascii="Times New Roman"/>
           <w:sz w:val="24"/>
         </w:rPr>
-        <w:t>Any spot chartered Supply Vessel at VT if required to assist the evacuation in the field will sail immediately.</w:t>
+        <w:t xml:space="preserve">Any </w:t>
+      </w:r>
+      <w:proofErr w:type="gramStart"/>
+      <w:r>
+        <w:rPr>
+          <w:rFonts w:ascii="Times New Roman"/>
+          <w:sz w:val="24"/>
+        </w:rPr>
+        <w:t>spot chartered</w:t>
+      </w:r>
+      <w:proofErr w:type="gramEnd"/>
+      <w:r>
+        <w:rPr>
+          <w:rFonts w:ascii="Times New Roman"/>
+          <w:sz w:val="24"/>
+        </w:rPr>
+        <w:t xml:space="preserve"> Supply Vessel at VT if required to assist the evacuation in the field will sail immediately.</w:t>
       </w:r>
     </w:p>
     <w:p>
@@ -10336,7 +11470,23 @@
           <w:rFonts w:ascii="Times New Roman"/>
           <w:sz w:val="24"/>
         </w:rPr>
-        <w:t xml:space="preserve">Order of re-manning the facilities shall be decided by the both OIM/FM </w:t>
+        <w:t xml:space="preserve">Order of re-manning the facilities shall be decided by </w:t>
+      </w:r>
+      <w:proofErr w:type="gramStart"/>
+      <w:r>
+        <w:rPr>
+          <w:rFonts w:ascii="Times New Roman"/>
+          <w:sz w:val="24"/>
+        </w:rPr>
+        <w:t>the both</w:t>
+      </w:r>
+      <w:proofErr w:type="gramEnd"/>
+      <w:r>
+        <w:rPr>
+          <w:rFonts w:ascii="Times New Roman"/>
+          <w:sz w:val="24"/>
+        </w:rPr>
+        <w:t xml:space="preserve"> OIM/FM </w:t>
       </w:r>
       <w:r>
         <w:rPr>
@@ -10386,7 +11536,39 @@
           <w:sz w:val="24"/>
         </w:rPr>
         <w:lastRenderedPageBreak/>
-        <w:t xml:space="preserve">A details inspection of the facilities shall be made by the both OIM/FM </w:t>
+        <w:t xml:space="preserve">A </w:t>
+      </w:r>
+      <w:proofErr w:type="gramStart"/>
+      <w:r>
+        <w:rPr>
+          <w:rFonts w:ascii="Times New Roman"/>
+          <w:sz w:val="24"/>
+        </w:rPr>
+        <w:t>details</w:t>
+      </w:r>
+      <w:proofErr w:type="gramEnd"/>
+      <w:r>
+        <w:rPr>
+          <w:rFonts w:ascii="Times New Roman"/>
+          <w:sz w:val="24"/>
+        </w:rPr>
+        <w:t xml:space="preserve"> inspection of the facilities shall be made by </w:t>
+      </w:r>
+      <w:proofErr w:type="gramStart"/>
+      <w:r>
+        <w:rPr>
+          <w:rFonts w:ascii="Times New Roman"/>
+          <w:sz w:val="24"/>
+        </w:rPr>
+        <w:t>the both</w:t>
+      </w:r>
+      <w:proofErr w:type="gramEnd"/>
+      <w:r>
+        <w:rPr>
+          <w:rFonts w:ascii="Times New Roman"/>
+          <w:sz w:val="24"/>
+        </w:rPr>
+        <w:t xml:space="preserve"> OIM/FM </w:t>
       </w:r>
       <w:r>
         <w:rPr>
@@ -10400,7 +11582,23 @@
           <w:rFonts w:ascii="Times New Roman"/>
           <w:sz w:val="24"/>
         </w:rPr>
-        <w:t xml:space="preserve"> and his supporting teams before the full POB are mobilized.</w:t>
+        <w:t xml:space="preserve"> and </w:t>
+      </w:r>
+      <w:proofErr w:type="gramStart"/>
+      <w:r>
+        <w:rPr>
+          <w:rFonts w:ascii="Times New Roman"/>
+          <w:sz w:val="24"/>
+        </w:rPr>
+        <w:t>his</w:t>
+      </w:r>
+      <w:proofErr w:type="gramEnd"/>
+      <w:r>
+        <w:rPr>
+          <w:rFonts w:ascii="Times New Roman"/>
+          <w:sz w:val="24"/>
+        </w:rPr>
+        <w:t xml:space="preserve"> supporting teams before the full POB are mobilized.</w:t>
       </w:r>
     </w:p>
     <w:p>
@@ -10435,7 +11633,23 @@
           <w:rFonts w:ascii="Times New Roman"/>
           <w:sz w:val="24"/>
         </w:rPr>
-        <w:t xml:space="preserve"> for immediate action and follow up.</w:t>
+        <w:t xml:space="preserve"> for immediate action and </w:t>
+      </w:r>
+      <w:proofErr w:type="gramStart"/>
+      <w:r>
+        <w:rPr>
+          <w:rFonts w:ascii="Times New Roman"/>
+          <w:sz w:val="24"/>
+        </w:rPr>
+        <w:t>follow up</w:t>
+      </w:r>
+      <w:proofErr w:type="gramEnd"/>
+      <w:r>
+        <w:rPr>
+          <w:rFonts w:ascii="Times New Roman"/>
+          <w:sz w:val="24"/>
+        </w:rPr>
+        <w:t>.</w:t>
       </w:r>
     </w:p>
     <w:p>
@@ -10470,7 +11684,23 @@
           <w:rFonts w:ascii="Times New Roman"/>
           <w:sz w:val="24"/>
         </w:rPr>
-        <w:t xml:space="preserve"> will complete the full damage report within one week and submit to </w:t>
+        <w:t xml:space="preserve"> will complete the full damage report within one week and </w:t>
+      </w:r>
+      <w:proofErr w:type="gramStart"/>
+      <w:r>
+        <w:rPr>
+          <w:rFonts w:ascii="Times New Roman"/>
+          <w:sz w:val="24"/>
+        </w:rPr>
+        <w:t>submit</w:t>
+      </w:r>
+      <w:proofErr w:type="gramEnd"/>
+      <w:r>
+        <w:rPr>
+          <w:rFonts w:ascii="Times New Roman"/>
+          <w:sz w:val="24"/>
+        </w:rPr>
+        <w:t xml:space="preserve"> to </w:t>
       </w:r>
       <w:r>
         <w:rPr>
@@ -10484,7 +11714,23 @@
           <w:rFonts w:ascii="Times New Roman"/>
           <w:sz w:val="24"/>
         </w:rPr>
-        <w:t xml:space="preserve"> operation teams for further action and lessons learned. </w:t>
+        <w:t xml:space="preserve"> operation teams for further action and </w:t>
+      </w:r>
+      <w:proofErr w:type="gramStart"/>
+      <w:r>
+        <w:rPr>
+          <w:rFonts w:ascii="Times New Roman"/>
+          <w:sz w:val="24"/>
+        </w:rPr>
+        <w:t>lessons learned</w:t>
+      </w:r>
+      <w:proofErr w:type="gramEnd"/>
+      <w:r>
+        <w:rPr>
+          <w:rFonts w:ascii="Times New Roman"/>
+          <w:sz w:val="24"/>
+        </w:rPr>
+        <w:t xml:space="preserve">. </w:t>
       </w:r>
     </w:p>
     <w:p>
@@ -10526,7 +11772,27 @@
           <w:color w:val="000000"/>
           <w:sz w:val="24"/>
         </w:rPr>
-        <w:t xml:space="preserve">All report and records will be maintained by OIM/FM and a copy will be sent to Operation Team and keep at </w:t>
+        <w:t>All report and records will be maintained by OIM/</w:t>
+      </w:r>
+      <w:proofErr w:type="gramStart"/>
+      <w:r>
+        <w:rPr>
+          <w:rFonts w:ascii="Times New Roman"/>
+          <w:bCs/>
+          <w:color w:val="000000"/>
+          <w:sz w:val="24"/>
+        </w:rPr>
+        <w:t>FM</w:t>
+      </w:r>
+      <w:proofErr w:type="gramEnd"/>
+      <w:r>
+        <w:rPr>
+          <w:rFonts w:ascii="Times New Roman"/>
+          <w:bCs/>
+          <w:color w:val="000000"/>
+          <w:sz w:val="24"/>
+        </w:rPr>
+        <w:t xml:space="preserve"> and a copy will be sent to Operation Team and keep at </w:t>
       </w:r>
       <w:r>
         <w:rPr>
@@ -10599,7 +11865,7 @@
           <w:numId w:val="32"/>
         </w:numPr>
       </w:pPr>
-      <w:hyperlink r:id="rId5" w:history="1">
+      <w:hyperlink r:id="rId7" w:history="1">
         <w:r>
           <w:rPr>
             <w:rStyle w:val="Hyperlink"/>
@@ -10619,7 +11885,7 @@
           <w:numId w:val="32"/>
         </w:numPr>
       </w:pPr>
-      <w:hyperlink r:id="rId6" w:history="1">
+      <w:hyperlink r:id="rId8" w:history="1">
         <w:r>
           <w:rPr>
             <w:rStyle w:val="Hyperlink"/>
@@ -10639,7 +11905,7 @@
           <w:numId w:val="32"/>
         </w:numPr>
       </w:pPr>
-      <w:hyperlink r:id="rId7" w:history="1">
+      <w:hyperlink r:id="rId9" w:history="1">
         <w:r>
           <w:rPr>
             <w:rStyle w:val="Hyperlink"/>
@@ -10659,7 +11925,7 @@
           <w:numId w:val="32"/>
         </w:numPr>
       </w:pPr>
-      <w:hyperlink r:id="rId8" w:history="1">
+      <w:hyperlink r:id="rId10" w:history="1">
         <w:r>
           <w:rPr>
             <w:rStyle w:val="Hyperlink"/>
@@ -10679,7 +11945,7 @@
           <w:numId w:val="32"/>
         </w:numPr>
       </w:pPr>
-      <w:hyperlink r:id="rId9" w:history="1">
+      <w:hyperlink r:id="rId11" w:history="1">
         <w:r>
           <w:rPr>
             <w:rStyle w:val="Hyperlink"/>
@@ -10699,7 +11965,7 @@
           <w:numId w:val="32"/>
         </w:numPr>
       </w:pPr>
-      <w:hyperlink r:id="rId10" w:history="1">
+      <w:hyperlink r:id="rId12" w:history="1">
         <w:r>
           <w:rPr>
             <w:rStyle w:val="Hyperlink"/>
@@ -10719,7 +11985,7 @@
           <w:numId w:val="32"/>
         </w:numPr>
       </w:pPr>
-      <w:hyperlink r:id="rId11" w:history="1">
+      <w:hyperlink r:id="rId13" w:history="1">
         <w:r>
           <w:rPr>
             <w:rStyle w:val="Hyperlink"/>
@@ -10739,7 +12005,7 @@
           <w:numId w:val="32"/>
         </w:numPr>
       </w:pPr>
-      <w:hyperlink r:id="rId12" w:history="1">
+      <w:hyperlink r:id="rId14" w:history="1">
         <w:bookmarkStart w:id="2" w:name="_Toc425344938"/>
         <w:r>
           <w:rPr>
@@ -10781,7 +12047,7 @@
           <w:szCs w:val="22"/>
         </w:rPr>
         <w:sectPr>
-          <w:headerReference w:type="default" r:id="rId13"/>
+          <w:headerReference w:type="default" r:id="rId15"/>
           <w:pgSz w:w="11909" w:h="16834" w:code="9"/>
           <w:pgMar w:top="1244" w:right="1701" w:bottom="1701" w:left="1701" w:header="851" w:footer="992" w:gutter="0"/>
           <w:cols w:space="720"/>
@@ -11069,7 +12335,23 @@
                 <w:rFonts w:ascii="Times New Roman"/>
                 <w:bCs/>
               </w:rPr>
-              <w:t>Sea state photo</w:t>
+              <w:t xml:space="preserve">Sea </w:t>
+            </w:r>
+            <w:proofErr w:type="gramStart"/>
+            <w:r>
+              <w:rPr>
+                <w:rFonts w:ascii="Times New Roman"/>
+                <w:bCs/>
+              </w:rPr>
+              <w:t>state</w:t>
+            </w:r>
+            <w:proofErr w:type="gramEnd"/>
+            <w:r>
+              <w:rPr>
+                <w:rFonts w:ascii="Times New Roman"/>
+                <w:bCs/>
+              </w:rPr>
+              <w:t xml:space="preserve"> photo</w:t>
             </w:r>
           </w:p>
         </w:tc>
@@ -11110,7 +12392,7 @@
                 <w:bCs/>
               </w:rPr>
             </w:pPr>
-            <w:hyperlink r:id="rId14" w:tooltip="Knot (speed)" w:history="1">
+            <w:hyperlink r:id="rId16" w:tooltip="Knot (speed)" w:history="1">
               <w:r>
                 <w:rPr>
                   <w:rStyle w:val="Hyperlink"/>
@@ -11137,7 +12419,7 @@
                 <w:bCs/>
               </w:rPr>
             </w:pPr>
-            <w:hyperlink r:id="rId15" w:tooltip="Kilometre per hour" w:history="1">
+            <w:hyperlink r:id="rId17" w:tooltip="Kilometre per hour" w:history="1">
               <w:r>
                 <w:rPr>
                   <w:rStyle w:val="Hyperlink"/>
@@ -11164,7 +12446,7 @@
                 <w:bCs/>
               </w:rPr>
             </w:pPr>
-            <w:hyperlink r:id="rId16" w:tooltip="Mile per hour" w:history="1">
+            <w:hyperlink r:id="rId18" w:tooltip="Mile per hour" w:history="1">
               <w:r>
                 <w:rPr>
                   <w:rStyle w:val="Hyperlink"/>
@@ -11191,7 +12473,7 @@
                 <w:bCs/>
               </w:rPr>
             </w:pPr>
-            <w:hyperlink r:id="rId17" w:tooltip="Metre per second" w:history="1">
+            <w:hyperlink r:id="rId19" w:tooltip="Metre per second" w:history="1">
               <w:r>
                 <w:rPr>
                   <w:rStyle w:val="Hyperlink"/>
@@ -11250,7 +12532,7 @@
                 <w:bCs/>
               </w:rPr>
             </w:pPr>
-            <w:hyperlink r:id="rId18" w:tooltip="Metre" w:history="1">
+            <w:hyperlink r:id="rId20" w:tooltip="Metre" w:history="1">
               <w:r>
                 <w:rPr>
                   <w:rStyle w:val="Hyperlink"/>
@@ -11277,7 +12559,7 @@
                 <w:bCs/>
               </w:rPr>
             </w:pPr>
-            <w:hyperlink r:id="rId19" w:tooltip="Foot (unit of length)" w:history="1">
+            <w:hyperlink r:id="rId21" w:tooltip="Foot (unit of length)" w:history="1">
               <w:r>
                 <w:rPr>
                   <w:rStyle w:val="Hyperlink"/>
@@ -11481,7 +12763,7 @@
                 <w:rFonts w:ascii="Times New Roman"/>
               </w:rPr>
             </w:pPr>
-            <w:hyperlink r:id="rId20" w:tooltip="Calm" w:history="1">
+            <w:hyperlink r:id="rId22" w:tooltip="Calm" w:history="1">
               <w:r>
                 <w:rPr>
                   <w:rStyle w:val="Hyperlink"/>
@@ -11595,7 +12877,7 @@
                   <wp:extent cx="572770" cy="532765"/>
                   <wp:effectExtent l="0" t="0" r="0" b="635"/>
                   <wp:docPr id="101" name="Picture 4" descr="http://upload.wikimedia.org/wikipedia/commons/thumb/f/fc/Beaufort_scale_0.jpg/60px-Beaufort_scale_0.jpg">
-                    <a:hlinkClick xmlns:a="http://schemas.openxmlformats.org/drawingml/2006/main" r:id="rId21" tooltip="Beaufort scale 0.jpg"/>
+                    <a:hlinkClick xmlns:a="http://schemas.openxmlformats.org/drawingml/2006/main" r:id="rId23" tooltip="Beaufort scale 0.jpg"/>
                   </wp:docPr>
                   <wp:cNvGraphicFramePr>
                     <a:graphicFrameLocks xmlns:a="http://schemas.openxmlformats.org/drawingml/2006/main" noChangeAspect="1"/>
@@ -11610,7 +12892,7 @@
                           </pic:cNvPicPr>
                         </pic:nvPicPr>
                         <pic:blipFill>
-                          <a:blip r:embed="rId22" r:link="rId23" cstate="print">
+                          <a:blip r:embed="rId24" r:link="rId25" cstate="print">
                             <a:extLst>
                               <a:ext uri="{28A0092B-C50C-407E-A947-70E740481C1C}">
                                 <a14:useLocalDpi xmlns:a14="http://schemas.microsoft.com/office/drawing/2010/main" val="0"/>
@@ -11786,7 +13068,7 @@
                 <w:rFonts w:ascii="Times New Roman"/>
               </w:rPr>
             </w:pPr>
-            <w:hyperlink r:id="rId24" w:tooltip="Light air" w:history="1">
+            <w:hyperlink r:id="rId26" w:tooltip="Light air" w:history="1">
               <w:r>
                 <w:rPr>
                   <w:rStyle w:val="Hyperlink"/>
@@ -11899,7 +13181,7 @@
                   <wp:extent cx="572770" cy="572770"/>
                   <wp:effectExtent l="0" t="0" r="0" b="0"/>
                   <wp:docPr id="100" name="Picture 5" descr="http://upload.wikimedia.org/wikipedia/commons/thumb/1/18/Beaufort_scale_1.jpg/60px-Beaufort_scale_1.jpg">
-                    <a:hlinkClick xmlns:a="http://schemas.openxmlformats.org/drawingml/2006/main" r:id="rId25" tooltip="Beaufort scale 1.jpg"/>
+                    <a:hlinkClick xmlns:a="http://schemas.openxmlformats.org/drawingml/2006/main" r:id="rId27" tooltip="Beaufort scale 1.jpg"/>
                   </wp:docPr>
                   <wp:cNvGraphicFramePr>
                     <a:graphicFrameLocks xmlns:a="http://schemas.openxmlformats.org/drawingml/2006/main" noChangeAspect="1"/>
@@ -11914,7 +13196,7 @@
                           </pic:cNvPicPr>
                         </pic:nvPicPr>
                         <pic:blipFill>
-                          <a:blip r:embed="rId26" r:link="rId27" cstate="print">
+                          <a:blip r:embed="rId28" r:link="rId29" cstate="print">
                             <a:extLst>
                               <a:ext uri="{28A0092B-C50C-407E-A947-70E740481C1C}">
                                 <a14:useLocalDpi xmlns:a14="http://schemas.microsoft.com/office/drawing/2010/main" val="0"/>
@@ -12096,7 +13378,7 @@
               </w:rPr>
               <w:t xml:space="preserve">Light </w:t>
             </w:r>
-            <w:hyperlink r:id="rId28" w:tooltip="Breeze" w:history="1">
+            <w:hyperlink r:id="rId30" w:tooltip="Breeze" w:history="1">
               <w:r>
                 <w:rPr>
                   <w:rStyle w:val="Hyperlink"/>
@@ -12181,7 +13463,21 @@
               <w:rPr>
                 <w:rFonts w:ascii="Times New Roman"/>
               </w:rPr>
-              <w:t>Wind felt on exposed skin. Leaves rustle.</w:t>
+              <w:t xml:space="preserve">Wind </w:t>
+            </w:r>
+            <w:proofErr w:type="gramStart"/>
+            <w:r>
+              <w:rPr>
+                <w:rFonts w:ascii="Times New Roman"/>
+              </w:rPr>
+              <w:t>felt</w:t>
+            </w:r>
+            <w:proofErr w:type="gramEnd"/>
+            <w:r>
+              <w:rPr>
+                <w:rFonts w:ascii="Times New Roman"/>
+              </w:rPr>
+              <w:t xml:space="preserve"> on exposed skin. Leaves rustle.</w:t>
             </w:r>
           </w:p>
         </w:tc>
@@ -12209,7 +13505,7 @@
                   <wp:extent cx="572770" cy="572770"/>
                   <wp:effectExtent l="0" t="0" r="0" b="0"/>
                   <wp:docPr id="99" name="Picture 6" descr="http://upload.wikimedia.org/wikipedia/commons/thumb/d/d1/Beaufort_scale_2.jpg/60px-Beaufort_scale_2.jpg">
-                    <a:hlinkClick xmlns:a="http://schemas.openxmlformats.org/drawingml/2006/main" r:id="rId29" tooltip="Beaufort scale 2.jpg"/>
+                    <a:hlinkClick xmlns:a="http://schemas.openxmlformats.org/drawingml/2006/main" r:id="rId31" tooltip="Beaufort scale 2.jpg"/>
                   </wp:docPr>
                   <wp:cNvGraphicFramePr>
                     <a:graphicFrameLocks xmlns:a="http://schemas.openxmlformats.org/drawingml/2006/main" noChangeAspect="1"/>
@@ -12224,7 +13520,7 @@
                           </pic:cNvPicPr>
                         </pic:nvPicPr>
                         <pic:blipFill>
-                          <a:blip r:embed="rId30" r:link="rId31" cstate="print">
+                          <a:blip r:embed="rId32" r:link="rId33" cstate="print">
                             <a:extLst>
                               <a:ext uri="{28A0092B-C50C-407E-A947-70E740481C1C}">
                                 <a14:useLocalDpi xmlns:a14="http://schemas.microsoft.com/office/drawing/2010/main" val="0"/>
@@ -12406,7 +13702,7 @@
               </w:rPr>
               <w:t xml:space="preserve">Gentle </w:t>
             </w:r>
-            <w:hyperlink r:id="rId32" w:tooltip="Breeze" w:history="1">
+            <w:hyperlink r:id="rId34" w:tooltip="Breeze" w:history="1">
               <w:r>
                 <w:rPr>
                   <w:rStyle w:val="Hyperlink"/>
@@ -12519,7 +13815,7 @@
                   <wp:extent cx="572770" cy="572770"/>
                   <wp:effectExtent l="0" t="0" r="0" b="0"/>
                   <wp:docPr id="98" name="Picture 7" descr="http://upload.wikimedia.org/wikipedia/commons/thumb/5/51/Beaufort_scale_3.jpg/60px-Beaufort_scale_3.jpg">
-                    <a:hlinkClick xmlns:a="http://schemas.openxmlformats.org/drawingml/2006/main" r:id="rId33" tooltip="Beaufort scale 3.jpg"/>
+                    <a:hlinkClick xmlns:a="http://schemas.openxmlformats.org/drawingml/2006/main" r:id="rId35" tooltip="Beaufort scale 3.jpg"/>
                   </wp:docPr>
                   <wp:cNvGraphicFramePr>
                     <a:graphicFrameLocks xmlns:a="http://schemas.openxmlformats.org/drawingml/2006/main" noChangeAspect="1"/>
@@ -12534,7 +13830,7 @@
                           </pic:cNvPicPr>
                         </pic:nvPicPr>
                         <pic:blipFill>
-                          <a:blip r:embed="rId34" r:link="rId35" cstate="print">
+                          <a:blip r:embed="rId36" r:link="rId37" cstate="print">
                             <a:extLst>
                               <a:ext uri="{28A0092B-C50C-407E-A947-70E740481C1C}">
                                 <a14:useLocalDpi xmlns:a14="http://schemas.microsoft.com/office/drawing/2010/main" val="0"/>
@@ -12716,7 +14012,7 @@
               </w:rPr>
               <w:t xml:space="preserve">Moderate </w:t>
             </w:r>
-            <w:hyperlink r:id="rId36" w:tooltip="Breeze" w:history="1">
+            <w:hyperlink r:id="rId38" w:tooltip="Breeze" w:history="1">
               <w:r>
                 <w:rPr>
                   <w:rStyle w:val="Hyperlink"/>
@@ -12829,7 +14125,7 @@
                   <wp:extent cx="572770" cy="552450"/>
                   <wp:effectExtent l="0" t="0" r="0" b="0"/>
                   <wp:docPr id="97" name="Picture 8" descr="http://upload.wikimedia.org/wikipedia/commons/thumb/0/0f/Beaufort_scale_4.jpg/60px-Beaufort_scale_4.jpg">
-                    <a:hlinkClick xmlns:a="http://schemas.openxmlformats.org/drawingml/2006/main" r:id="rId37" tooltip="Beaufort scale 4.jpg"/>
+                    <a:hlinkClick xmlns:a="http://schemas.openxmlformats.org/drawingml/2006/main" r:id="rId39" tooltip="Beaufort scale 4.jpg"/>
                   </wp:docPr>
                   <wp:cNvGraphicFramePr>
                     <a:graphicFrameLocks xmlns:a="http://schemas.openxmlformats.org/drawingml/2006/main" noChangeAspect="1"/>
@@ -12844,7 +14140,7 @@
                           </pic:cNvPicPr>
                         </pic:nvPicPr>
                         <pic:blipFill>
-                          <a:blip r:embed="rId38" r:link="rId39" cstate="print">
+                          <a:blip r:embed="rId40" r:link="rId41" cstate="print">
                             <a:extLst>
                               <a:ext uri="{28A0092B-C50C-407E-A947-70E740481C1C}">
                                 <a14:useLocalDpi xmlns:a14="http://schemas.microsoft.com/office/drawing/2010/main" val="0"/>
@@ -13027,7 +14323,7 @@
               </w:rPr>
               <w:t xml:space="preserve">Fresh </w:t>
             </w:r>
-            <w:hyperlink r:id="rId40" w:tooltip="Breeze" w:history="1">
+            <w:hyperlink r:id="rId42" w:tooltip="Breeze" w:history="1">
               <w:r>
                 <w:rPr>
                   <w:rStyle w:val="Hyperlink"/>
@@ -13140,7 +14436,7 @@
                   <wp:extent cx="572770" cy="552450"/>
                   <wp:effectExtent l="0" t="0" r="0" b="0"/>
                   <wp:docPr id="96" name="Picture 9" descr="http://upload.wikimedia.org/wikipedia/commons/thumb/2/2b/Beaufort_scale_5.jpg/60px-Beaufort_scale_5.jpg">
-                    <a:hlinkClick xmlns:a="http://schemas.openxmlformats.org/drawingml/2006/main" r:id="rId41" tooltip="Beaufort scale 5.jpg"/>
+                    <a:hlinkClick xmlns:a="http://schemas.openxmlformats.org/drawingml/2006/main" r:id="rId43" tooltip="Beaufort scale 5.jpg"/>
                   </wp:docPr>
                   <wp:cNvGraphicFramePr>
                     <a:graphicFrameLocks xmlns:a="http://schemas.openxmlformats.org/drawingml/2006/main" noChangeAspect="1"/>
@@ -13155,7 +14451,7 @@
                           </pic:cNvPicPr>
                         </pic:nvPicPr>
                         <pic:blipFill>
-                          <a:blip r:embed="rId42" r:link="rId43" cstate="print">
+                          <a:blip r:embed="rId44" r:link="rId45" cstate="print">
                             <a:extLst>
                               <a:ext uri="{28A0092B-C50C-407E-A947-70E740481C1C}">
                                 <a14:useLocalDpi xmlns:a14="http://schemas.microsoft.com/office/drawing/2010/main" val="0"/>
@@ -13337,7 +14633,7 @@
               </w:rPr>
               <w:t xml:space="preserve">Strong </w:t>
             </w:r>
-            <w:hyperlink r:id="rId44" w:tooltip="Breeze" w:history="1">
+            <w:hyperlink r:id="rId46" w:tooltip="Breeze" w:history="1">
               <w:r>
                 <w:rPr>
                   <w:rStyle w:val="Hyperlink"/>
@@ -13451,7 +14747,7 @@
                   <wp:extent cx="572770" cy="552450"/>
                   <wp:effectExtent l="0" t="0" r="0" b="0"/>
                   <wp:docPr id="95" name="Picture 10" descr="http://upload.wikimedia.org/wikipedia/commons/thumb/e/e9/Beaufort_scale_6.jpg/60px-Beaufort_scale_6.jpg">
-                    <a:hlinkClick xmlns:a="http://schemas.openxmlformats.org/drawingml/2006/main" r:id="rId45" tooltip="Beaufort scale 6.jpg"/>
+                    <a:hlinkClick xmlns:a="http://schemas.openxmlformats.org/drawingml/2006/main" r:id="rId47" tooltip="Beaufort scale 6.jpg"/>
                   </wp:docPr>
                   <wp:cNvGraphicFramePr>
                     <a:graphicFrameLocks xmlns:a="http://schemas.openxmlformats.org/drawingml/2006/main" noChangeAspect="1"/>
@@ -13466,7 +14762,7 @@
                           </pic:cNvPicPr>
                         </pic:nvPicPr>
                         <pic:blipFill>
-                          <a:blip r:embed="rId46" r:link="rId47" cstate="print">
+                          <a:blip r:embed="rId48" r:link="rId49" cstate="print">
                             <a:extLst>
                               <a:ext uri="{28A0092B-C50C-407E-A947-70E740481C1C}">
                                 <a14:useLocalDpi xmlns:a14="http://schemas.microsoft.com/office/drawing/2010/main" val="0"/>
@@ -13649,7 +14945,7 @@
               </w:rPr>
               <w:t xml:space="preserve">Moderate </w:t>
             </w:r>
-            <w:hyperlink r:id="rId48" w:tooltip="Gale" w:history="1">
+            <w:hyperlink r:id="rId50" w:tooltip="Gale" w:history="1">
               <w:r>
                 <w:rPr>
                   <w:rStyle w:val="Hyperlink"/>
@@ -13763,7 +15059,7 @@
                   <wp:extent cx="572770" cy="552450"/>
                   <wp:effectExtent l="0" t="0" r="0" b="0"/>
                   <wp:docPr id="94" name="Picture 11" descr="http://upload.wikimedia.org/wikipedia/commons/thumb/5/5c/Beaufort_scale_7.jpg/60px-Beaufort_scale_7.jpg">
-                    <a:hlinkClick xmlns:a="http://schemas.openxmlformats.org/drawingml/2006/main" r:id="rId49" tooltip="Beaufort scale 7.jpg"/>
+                    <a:hlinkClick xmlns:a="http://schemas.openxmlformats.org/drawingml/2006/main" r:id="rId51" tooltip="Beaufort scale 7.jpg"/>
                   </wp:docPr>
                   <wp:cNvGraphicFramePr>
                     <a:graphicFrameLocks xmlns:a="http://schemas.openxmlformats.org/drawingml/2006/main" noChangeAspect="1"/>
@@ -13778,7 +15074,7 @@
                           </pic:cNvPicPr>
                         </pic:nvPicPr>
                         <pic:blipFill>
-                          <a:blip r:embed="rId50" r:link="rId51" cstate="print">
+                          <a:blip r:embed="rId52" r:link="rId53" cstate="print">
                             <a:extLst>
                               <a:ext uri="{28A0092B-C50C-407E-A947-70E740481C1C}">
                                 <a14:useLocalDpi xmlns:a14="http://schemas.microsoft.com/office/drawing/2010/main" val="0"/>
@@ -13961,7 +15257,7 @@
               </w:rPr>
               <w:t xml:space="preserve">Fresh </w:t>
             </w:r>
-            <w:hyperlink r:id="rId52" w:tooltip="Gale" w:history="1">
+            <w:hyperlink r:id="rId54" w:tooltip="Gale" w:history="1">
               <w:r>
                 <w:rPr>
                   <w:rStyle w:val="Hyperlink"/>
@@ -14047,7 +15343,21 @@
               <w:rPr>
                 <w:rFonts w:ascii="Times New Roman"/>
               </w:rPr>
-              <w:t>Twigs broken from trees. Cars veer on road.</w:t>
+              <w:t xml:space="preserve">Twigs </w:t>
+            </w:r>
+            <w:proofErr w:type="gramStart"/>
+            <w:r>
+              <w:rPr>
+                <w:rFonts w:ascii="Times New Roman"/>
+              </w:rPr>
+              <w:t>broken</w:t>
+            </w:r>
+            <w:proofErr w:type="gramEnd"/>
+            <w:r>
+              <w:rPr>
+                <w:rFonts w:ascii="Times New Roman"/>
+              </w:rPr>
+              <w:t xml:space="preserve"> from trees. Cars veer on road.</w:t>
             </w:r>
           </w:p>
         </w:tc>
@@ -14075,7 +15385,7 @@
                   <wp:extent cx="572770" cy="562610"/>
                   <wp:effectExtent l="0" t="0" r="0" b="8890"/>
                   <wp:docPr id="93" name="Picture 12" descr="http://upload.wikimedia.org/wikipedia/commons/thumb/0/00/Beaufort_scale_8.jpg/60px-Beaufort_scale_8.jpg">
-                    <a:hlinkClick xmlns:a="http://schemas.openxmlformats.org/drawingml/2006/main" r:id="rId53" tooltip="Beaufort scale 8.jpg"/>
+                    <a:hlinkClick xmlns:a="http://schemas.openxmlformats.org/drawingml/2006/main" r:id="rId55" tooltip="Beaufort scale 8.jpg"/>
                   </wp:docPr>
                   <wp:cNvGraphicFramePr>
                     <a:graphicFrameLocks xmlns:a="http://schemas.openxmlformats.org/drawingml/2006/main" noChangeAspect="1"/>
@@ -14090,7 +15400,7 @@
                           </pic:cNvPicPr>
                         </pic:nvPicPr>
                         <pic:blipFill>
-                          <a:blip r:embed="rId54" r:link="rId55" cstate="print">
+                          <a:blip r:embed="rId56" r:link="rId57" cstate="print">
                             <a:extLst>
                               <a:ext uri="{28A0092B-C50C-407E-A947-70E740481C1C}">
                                 <a14:useLocalDpi xmlns:a14="http://schemas.microsoft.com/office/drawing/2010/main" val="0"/>
@@ -14273,7 +15583,7 @@
               </w:rPr>
               <w:t xml:space="preserve">Strong </w:t>
             </w:r>
-            <w:hyperlink r:id="rId56" w:tooltip="Gale" w:history="1">
+            <w:hyperlink r:id="rId58" w:tooltip="Gale" w:history="1">
               <w:r>
                 <w:rPr>
                   <w:rStyle w:val="Hyperlink"/>
@@ -14387,7 +15697,7 @@
                   <wp:extent cx="572770" cy="562610"/>
                   <wp:effectExtent l="0" t="0" r="0" b="8890"/>
                   <wp:docPr id="92" name="Picture 13" descr="http://upload.wikimedia.org/wikipedia/commons/thumb/d/d5/Beaufort_scale_9.jpg/60px-Beaufort_scale_9.jpg">
-                    <a:hlinkClick xmlns:a="http://schemas.openxmlformats.org/drawingml/2006/main" r:id="rId57" tooltip="Beaufort scale 9.jpg"/>
+                    <a:hlinkClick xmlns:a="http://schemas.openxmlformats.org/drawingml/2006/main" r:id="rId59" tooltip="Beaufort scale 9.jpg"/>
                   </wp:docPr>
                   <wp:cNvGraphicFramePr>
                     <a:graphicFrameLocks xmlns:a="http://schemas.openxmlformats.org/drawingml/2006/main" noChangeAspect="1"/>
@@ -14402,7 +15712,7 @@
                           </pic:cNvPicPr>
                         </pic:nvPicPr>
                         <pic:blipFill>
-                          <a:blip r:embed="rId58" r:link="rId59" cstate="print">
+                          <a:blip r:embed="rId60" r:link="rId61" cstate="print">
                             <a:extLst>
                               <a:ext uri="{28A0092B-C50C-407E-A947-70E740481C1C}">
                                 <a14:useLocalDpi xmlns:a14="http://schemas.microsoft.com/office/drawing/2010/main" val="0"/>
@@ -14579,7 +15889,7 @@
                 <w:rFonts w:ascii="Times New Roman"/>
               </w:rPr>
             </w:pPr>
-            <w:hyperlink r:id="rId60" w:tooltip="Storm" w:history="1">
+            <w:hyperlink r:id="rId62" w:tooltip="Storm" w:history="1">
               <w:r>
                 <w:rPr>
                   <w:rStyle w:val="Hyperlink"/>
@@ -14693,7 +16003,7 @@
                   <wp:extent cx="572770" cy="602615"/>
                   <wp:effectExtent l="0" t="0" r="0" b="6985"/>
                   <wp:docPr id="91" name="Picture 14" descr="http://upload.wikimedia.org/wikipedia/commons/thumb/8/86/Beaufort_scale_10.jpg/60px-Beaufort_scale_10.jpg">
-                    <a:hlinkClick xmlns:a="http://schemas.openxmlformats.org/drawingml/2006/main" r:id="rId61" tooltip="Beaufort scale 10.jpg"/>
+                    <a:hlinkClick xmlns:a="http://schemas.openxmlformats.org/drawingml/2006/main" r:id="rId63" tooltip="Beaufort scale 10.jpg"/>
                   </wp:docPr>
                   <wp:cNvGraphicFramePr>
                     <a:graphicFrameLocks xmlns:a="http://schemas.openxmlformats.org/drawingml/2006/main" noChangeAspect="1"/>
@@ -14708,7 +16018,7 @@
                           </pic:cNvPicPr>
                         </pic:nvPicPr>
                         <pic:blipFill>
-                          <a:blip r:embed="rId62" r:link="rId63" cstate="print">
+                          <a:blip r:embed="rId64" r:link="rId65" cstate="print">
                             <a:extLst>
                               <a:ext uri="{28A0092B-C50C-407E-A947-70E740481C1C}">
                                 <a14:useLocalDpi xmlns:a14="http://schemas.microsoft.com/office/drawing/2010/main" val="0"/>
@@ -14997,7 +16307,7 @@
                   <wp:extent cx="572770" cy="602615"/>
                   <wp:effectExtent l="0" t="0" r="0" b="6985"/>
                   <wp:docPr id="90" name="Picture 15" descr="http://upload.wikimedia.org/wikipedia/commons/thumb/1/16/Beaufort_scale_11.jpg/60px-Beaufort_scale_11.jpg">
-                    <a:hlinkClick xmlns:a="http://schemas.openxmlformats.org/drawingml/2006/main" r:id="rId64" tooltip="Beaufort scale 11.jpg"/>
+                    <a:hlinkClick xmlns:a="http://schemas.openxmlformats.org/drawingml/2006/main" r:id="rId66" tooltip="Beaufort scale 11.jpg"/>
                   </wp:docPr>
                   <wp:cNvGraphicFramePr>
                     <a:graphicFrameLocks xmlns:a="http://schemas.openxmlformats.org/drawingml/2006/main" noChangeAspect="1"/>
@@ -15012,7 +16322,7 @@
                           </pic:cNvPicPr>
                         </pic:nvPicPr>
                         <pic:blipFill>
-                          <a:blip r:embed="rId65" r:link="rId66" cstate="print">
+                          <a:blip r:embed="rId67" r:link="rId68" cstate="print">
                             <a:extLst>
                               <a:ext uri="{28A0092B-C50C-407E-A947-70E740481C1C}">
                                 <a14:useLocalDpi xmlns:a14="http://schemas.microsoft.com/office/drawing/2010/main" val="0"/>
@@ -15189,7 +16499,7 @@
                 <w:rFonts w:ascii="Times New Roman"/>
               </w:rPr>
             </w:pPr>
-            <w:hyperlink r:id="rId67" w:tooltip="Hurricane" w:history="1">
+            <w:hyperlink r:id="rId69" w:tooltip="Hurricane" w:history="1">
               <w:r>
                 <w:rPr>
                   <w:rStyle w:val="Hyperlink"/>
@@ -15303,7 +16613,7 @@
                   <wp:extent cx="572770" cy="572770"/>
                   <wp:effectExtent l="0" t="0" r="0" b="0"/>
                   <wp:docPr id="89" name="Picture 16" descr="http://upload.wikimedia.org/wikipedia/commons/thumb/c/ce/Beaufort_scale_12.jpg/60px-Beaufort_scale_12.jpg">
-                    <a:hlinkClick xmlns:a="http://schemas.openxmlformats.org/drawingml/2006/main" r:id="rId68" tooltip="Beaufort scale 12.jpg"/>
+                    <a:hlinkClick xmlns:a="http://schemas.openxmlformats.org/drawingml/2006/main" r:id="rId70" tooltip="Beaufort scale 12.jpg"/>
                   </wp:docPr>
                   <wp:cNvGraphicFramePr>
                     <a:graphicFrameLocks xmlns:a="http://schemas.openxmlformats.org/drawingml/2006/main" noChangeAspect="1"/>
@@ -15318,7 +16628,7 @@
                           </pic:cNvPicPr>
                         </pic:nvPicPr>
                         <pic:blipFill>
-                          <a:blip r:embed="rId69" r:link="rId70" cstate="print">
+                          <a:blip r:embed="rId71" r:link="rId72" cstate="print">
                             <a:extLst>
                               <a:ext uri="{28A0092B-C50C-407E-A947-70E740481C1C}">
                                 <a14:useLocalDpi xmlns:a14="http://schemas.microsoft.com/office/drawing/2010/main" val="0"/>
@@ -15418,6 +16728,7 @@
           <w:sz w:val="24"/>
         </w:rPr>
       </w:pPr>
+      <w:proofErr w:type="gramStart"/>
       <w:r>
         <w:rPr>
           <w:rFonts w:ascii="Times New Roman"/>
@@ -15426,6 +16737,7 @@
         </w:rPr>
         <w:t>Form</w:t>
       </w:r>
+      <w:proofErr w:type="gramEnd"/>
     </w:p>
     <w:p>
       <w:pPr>
@@ -15846,13 +17158,10 @@
                 <w:sz w:val="22"/>
                 <w:szCs w:val="22"/>
               </w:rPr>
-              <w:t>(nm/hrs)</w:t>
-            </w:r>
-          </w:p>
-          <w:p>
-            <w:pPr>
-              <w:adjustRightInd w:val="0"/>
-              <w:jc w:val="center"/>
+              <w:t>(nm/</w:t>
+            </w:r>
+            <w:proofErr w:type="spellStart"/>
+            <w:r>
               <w:rPr>
                 <w:rFonts w:ascii="Times New Roman"/>
                 <w:b/>
@@ -15861,12 +17170,10 @@
                 <w:sz w:val="22"/>
                 <w:szCs w:val="22"/>
               </w:rPr>
-            </w:pPr>
-          </w:p>
-          <w:p>
-            <w:pPr>
-              <w:adjustRightInd w:val="0"/>
-              <w:jc w:val="center"/>
+              <w:t>hrs</w:t>
+            </w:r>
+            <w:proofErr w:type="spellEnd"/>
+            <w:r>
               <w:rPr>
                 <w:rFonts w:ascii="Times New Roman"/>
                 <w:b/>
@@ -15875,11 +17182,13 @@
                 <w:sz w:val="22"/>
                 <w:szCs w:val="22"/>
               </w:rPr>
-            </w:pPr>
-          </w:p>
-          <w:p>
-            <w:pPr>
-              <w:adjustRightInd w:val="0"/>
+              <w:t>)</w:t>
+            </w:r>
+          </w:p>
+          <w:p>
+            <w:pPr>
+              <w:adjustRightInd w:val="0"/>
+              <w:jc w:val="center"/>
               <w:rPr>
                 <w:rFonts w:ascii="Times New Roman"/>
                 <w:b/>
@@ -15889,7 +17198,11 @@
                 <w:szCs w:val="22"/>
               </w:rPr>
             </w:pPr>
-            <w:r>
+          </w:p>
+          <w:p>
+            <w:pPr>
+              <w:adjustRightInd w:val="0"/>
+              <w:jc w:val="center"/>
               <w:rPr>
                 <w:rFonts w:ascii="Times New Roman"/>
                 <w:b/>
@@ -15898,7 +17211,78 @@
                 <w:sz w:val="22"/>
                 <w:szCs w:val="22"/>
               </w:rPr>
-              <w:t>(7)=(6)/(2)</w:t>
+            </w:pPr>
+          </w:p>
+          <w:p>
+            <w:pPr>
+              <w:adjustRightInd w:val="0"/>
+              <w:rPr>
+                <w:rFonts w:ascii="Times New Roman"/>
+                <w:b/>
+                <w:bCs/>
+                <w:color w:val="000000"/>
+                <w:sz w:val="22"/>
+                <w:szCs w:val="22"/>
+              </w:rPr>
+            </w:pPr>
+            <w:r>
+              <w:rPr>
+                <w:rFonts w:ascii="Times New Roman"/>
+                <w:b/>
+                <w:bCs/>
+                <w:color w:val="000000"/>
+                <w:sz w:val="22"/>
+                <w:szCs w:val="22"/>
+              </w:rPr>
+              <w:t>(</w:t>
+            </w:r>
+            <w:proofErr w:type="gramStart"/>
+            <w:r>
+              <w:rPr>
+                <w:rFonts w:ascii="Times New Roman"/>
+                <w:b/>
+                <w:bCs/>
+                <w:color w:val="000000"/>
+                <w:sz w:val="22"/>
+                <w:szCs w:val="22"/>
+              </w:rPr>
+              <w:t>7)=</w:t>
+            </w:r>
+            <w:proofErr w:type="gramEnd"/>
+            <w:r>
+              <w:rPr>
+                <w:rFonts w:ascii="Times New Roman"/>
+                <w:b/>
+                <w:bCs/>
+                <w:color w:val="000000"/>
+                <w:sz w:val="22"/>
+                <w:szCs w:val="22"/>
+              </w:rPr>
+              <w:t>(6)</w:t>
+            </w:r>
+            <w:proofErr w:type="gramStart"/>
+            <w:r>
+              <w:rPr>
+                <w:rFonts w:ascii="Times New Roman"/>
+                <w:b/>
+                <w:bCs/>
+                <w:color w:val="000000"/>
+                <w:sz w:val="22"/>
+                <w:szCs w:val="22"/>
+              </w:rPr>
+              <w:t>/(</w:t>
+            </w:r>
+            <w:proofErr w:type="gramEnd"/>
+            <w:r>
+              <w:rPr>
+                <w:rFonts w:ascii="Times New Roman"/>
+                <w:b/>
+                <w:bCs/>
+                <w:color w:val="000000"/>
+                <w:sz w:val="22"/>
+                <w:szCs w:val="22"/>
+              </w:rPr>
+              <w:t>2)</w:t>
             </w:r>
           </w:p>
         </w:tc>
@@ -15921,6 +17305,7 @@
                 <w:szCs w:val="22"/>
               </w:rPr>
             </w:pPr>
+            <w:proofErr w:type="spellStart"/>
             <w:r>
               <w:rPr>
                 <w:rFonts w:ascii="Times New Roman"/>
@@ -15930,7 +17315,19 @@
                 <w:sz w:val="22"/>
                 <w:szCs w:val="22"/>
               </w:rPr>
-              <w:t>Dist to Site</w:t>
+              <w:t>Dist</w:t>
+            </w:r>
+            <w:proofErr w:type="spellEnd"/>
+            <w:r>
+              <w:rPr>
+                <w:rFonts w:ascii="Times New Roman"/>
+                <w:b/>
+                <w:bCs/>
+                <w:color w:val="000000"/>
+                <w:sz w:val="22"/>
+                <w:szCs w:val="22"/>
+              </w:rPr>
+              <w:t xml:space="preserve"> to Site</w:t>
             </w:r>
           </w:p>
           <w:p>
@@ -16117,7 +17514,55 @@
                 <w:sz w:val="22"/>
                 <w:szCs w:val="22"/>
               </w:rPr>
-              <w:t>(9)=(8)-(3)/(7)</w:t>
+              <w:t>(</w:t>
+            </w:r>
+            <w:proofErr w:type="gramStart"/>
+            <w:r>
+              <w:rPr>
+                <w:rFonts w:ascii="Times New Roman"/>
+                <w:b/>
+                <w:bCs/>
+                <w:color w:val="000000"/>
+                <w:sz w:val="22"/>
+                <w:szCs w:val="22"/>
+              </w:rPr>
+              <w:t>9)=</w:t>
+            </w:r>
+            <w:proofErr w:type="gramEnd"/>
+            <w:r>
+              <w:rPr>
+                <w:rFonts w:ascii="Times New Roman"/>
+                <w:b/>
+                <w:bCs/>
+                <w:color w:val="000000"/>
+                <w:sz w:val="22"/>
+                <w:szCs w:val="22"/>
+              </w:rPr>
+              <w:t>(8)-(3)</w:t>
+            </w:r>
+            <w:proofErr w:type="gramStart"/>
+            <w:r>
+              <w:rPr>
+                <w:rFonts w:ascii="Times New Roman"/>
+                <w:b/>
+                <w:bCs/>
+                <w:color w:val="000000"/>
+                <w:sz w:val="22"/>
+                <w:szCs w:val="22"/>
+              </w:rPr>
+              <w:t>/(</w:t>
+            </w:r>
+            <w:proofErr w:type="gramEnd"/>
+            <w:r>
+              <w:rPr>
+                <w:rFonts w:ascii="Times New Roman"/>
+                <w:b/>
+                <w:bCs/>
+                <w:color w:val="000000"/>
+                <w:sz w:val="22"/>
+                <w:szCs w:val="22"/>
+              </w:rPr>
+              <w:t>7)</w:t>
             </w:r>
           </w:p>
         </w:tc>
@@ -17789,7 +19234,29 @@
           <w:sz w:val="22"/>
           <w:szCs w:val="22"/>
         </w:rPr>
-        <w:t>2. Subtract current report time from previous report time in column 1 and enter into column 2</w:t>
+        <w:t xml:space="preserve">2. Subtract current report time from previous report time in column 1 and </w:t>
+      </w:r>
+      <w:proofErr w:type="gramStart"/>
+      <w:r>
+        <w:rPr>
+          <w:rFonts w:ascii="Times New Roman"/>
+          <w:bCs/>
+          <w:color w:val="000000"/>
+          <w:sz w:val="22"/>
+          <w:szCs w:val="22"/>
+        </w:rPr>
+        <w:t>enter into</w:t>
+      </w:r>
+      <w:proofErr w:type="gramEnd"/>
+      <w:r>
+        <w:rPr>
+          <w:rFonts w:ascii="Times New Roman"/>
+          <w:bCs/>
+          <w:color w:val="000000"/>
+          <w:sz w:val="22"/>
+          <w:szCs w:val="22"/>
+        </w:rPr>
+        <w:t xml:space="preserve"> column 2</w:t>
       </w:r>
     </w:p>
     <w:p>
@@ -17850,8 +19317,8 @@
           <w:lang w:val="vi-VN"/>
         </w:rPr>
         <w:sectPr>
-          <w:headerReference w:type="default" r:id="rId71"/>
-          <w:footerReference w:type="default" r:id="rId72"/>
+          <w:headerReference w:type="default" r:id="rId73"/>
+          <w:footerReference w:type="default" r:id="rId74"/>
           <w:pgSz w:w="16834" w:h="11909" w:orient="landscape" w:code="9"/>
           <w:pgMar w:top="1139" w:right="1701" w:bottom="1701" w:left="1701" w:header="851" w:footer="992" w:gutter="0"/>
           <w:cols w:space="720"/>
@@ -17919,7 +19386,17 @@
           <w:highlight w:val="darkGreen"/>
           <w:shd w:val="clear" w:color="auto" w:fill="00B050"/>
         </w:rPr>
-        <w:t xml:space="preserve">ALERT </w:t>
+        <w:t>ALERT</w:t>
+      </w:r>
+      <w:proofErr w:type="gramStart"/>
+      <w:r>
+        <w:rPr>
+          <w:b/>
+          <w:color w:val="FFFFFF" w:themeColor="background1"/>
+          <w:highlight w:val="darkGreen"/>
+          <w:shd w:val="clear" w:color="auto" w:fill="00B050"/>
+        </w:rPr>
+        <w:t xml:space="preserve"> </w:t>
       </w:r>
       <w:r>
         <w:rPr>
@@ -17930,6 +19407,7 @@
         </w:rPr>
         <w:t>..</w:t>
       </w:r>
+      <w:proofErr w:type="gramEnd"/>
       <w:r>
         <w:rPr>
           <w:b/>
@@ -18535,7 +20013,15 @@
               <w:jc w:val="both"/>
             </w:pPr>
             <w:r>
-              <w:t>Helideck safe for helicopter landing and refueling operations.</w:t>
+              <w:t xml:space="preserve">Helideck </w:t>
+            </w:r>
+            <w:proofErr w:type="gramStart"/>
+            <w:r>
+              <w:t>safe</w:t>
+            </w:r>
+            <w:proofErr w:type="gramEnd"/>
+            <w:r>
+              <w:t xml:space="preserve"> for helicopter landing and refueling operations.</w:t>
             </w:r>
           </w:p>
         </w:tc>
@@ -18616,7 +20102,15 @@
               <w:jc w:val="both"/>
             </w:pPr>
             <w:r>
-              <w:t xml:space="preserve">Inform FSO, supply vessels within the field and Shore base of Blue alert and forward plan for possible evacuation. Shutdown off-take operations as appropriate. </w:t>
+              <w:t xml:space="preserve">Inform FSO, supply vessels within the field and Shore base of </w:t>
+            </w:r>
+            <w:proofErr w:type="gramStart"/>
+            <w:r>
+              <w:t>Blue</w:t>
+            </w:r>
+            <w:proofErr w:type="gramEnd"/>
+            <w:r>
+              <w:t xml:space="preserve"> alert and forward plan for possible evacuation. Shutdown off-take operations as appropriate. </w:t>
             </w:r>
           </w:p>
         </w:tc>
@@ -18643,7 +20137,15 @@
               <w:jc w:val="both"/>
             </w:pPr>
             <w:r>
-              <w:t>Ensure helicopter services are aware of weather conditions and advise of possible non-essential personnel evacuation - inform no. of PAX deemed to be Non-essential personnel.</w:t>
+              <w:t xml:space="preserve">Ensure helicopter services are aware of weather conditions and advise of possible non-essential personnel evacuation - inform no. of PAX deemed to be </w:t>
+            </w:r>
+            <w:proofErr w:type="gramStart"/>
+            <w:r>
+              <w:t>Non-essential</w:t>
+            </w:r>
+            <w:proofErr w:type="gramEnd"/>
+            <w:r>
+              <w:t xml:space="preserve"> personnel.</w:t>
             </w:r>
           </w:p>
         </w:tc>
@@ -18700,7 +20202,31 @@
               <w:jc w:val="both"/>
             </w:pPr>
             <w:r>
-              <w:t xml:space="preserve">Prepare a plan for personnel to remain onboard in the event that evacuation is not attainable for other reasons ( e.g. helicopters may be grounded ) </w:t>
+              <w:t xml:space="preserve">Prepare a plan for personnel to remain onboard </w:t>
+            </w:r>
+            <w:proofErr w:type="gramStart"/>
+            <w:r>
+              <w:t>in the event that</w:t>
+            </w:r>
+            <w:proofErr w:type="gramEnd"/>
+            <w:r>
+              <w:t xml:space="preserve"> evacuation is not attainable for other reasons </w:t>
+            </w:r>
+            <w:proofErr w:type="gramStart"/>
+            <w:r>
+              <w:t>( e.g.</w:t>
+            </w:r>
+            <w:proofErr w:type="gramEnd"/>
+            <w:r>
+              <w:t xml:space="preserve"> helicopters may be </w:t>
+            </w:r>
+            <w:proofErr w:type="gramStart"/>
+            <w:r>
+              <w:t>grounded )</w:t>
+            </w:r>
+            <w:proofErr w:type="gramEnd"/>
+            <w:r>
+              <w:t xml:space="preserve"> </w:t>
             </w:r>
           </w:p>
         </w:tc>
@@ -18817,7 +20343,15 @@
             </w:pPr>
             <w:r>
               <w:lastRenderedPageBreak/>
-              <w:t xml:space="preserve">Secure Medical room, ensure Medical supplies/ stretchers are kept in a state of readiness. </w:t>
+              <w:t xml:space="preserve">Secure Medical room, ensure </w:t>
+            </w:r>
+            <w:proofErr w:type="gramStart"/>
+            <w:r>
+              <w:t>Medical</w:t>
+            </w:r>
+            <w:proofErr w:type="gramEnd"/>
+            <w:r>
+              <w:t xml:space="preserve"> supplies/ stretchers are kept in a state of readiness. </w:t>
             </w:r>
           </w:p>
         </w:tc>
@@ -18980,7 +20514,15 @@
               <w:jc w:val="both"/>
             </w:pPr>
             <w:r>
-              <w:t xml:space="preserve">To initiate onshore emergency response, contacting the </w:t>
+              <w:t xml:space="preserve">To initiate onshore emergency response, </w:t>
+            </w:r>
+            <w:proofErr w:type="gramStart"/>
+            <w:r>
+              <w:t>contacting</w:t>
+            </w:r>
+            <w:proofErr w:type="gramEnd"/>
+            <w:r>
+              <w:t xml:space="preserve"> the </w:t>
             </w:r>
             <w:r>
               <w:t>IMT</w:t>
@@ -19013,7 +20555,15 @@
               <w:jc w:val="both"/>
             </w:pPr>
             <w:r>
-              <w:t>Confirm number of POB offshore and those deemed to be non-essential in case of evacuation operations as per Yellow alert.</w:t>
+              <w:t xml:space="preserve">Confirm number of POB offshore and those deemed to be non-essential in case of evacuation operations as per </w:t>
+            </w:r>
+            <w:proofErr w:type="gramStart"/>
+            <w:r>
+              <w:t>Yellow</w:t>
+            </w:r>
+            <w:proofErr w:type="gramEnd"/>
+            <w:r>
+              <w:t xml:space="preserve"> alert.</w:t>
             </w:r>
           </w:p>
         </w:tc>
@@ -19454,22 +21004,47 @@
           <w:bCs/>
           <w:szCs w:val="24"/>
         </w:rPr>
-        <w:t xml:space="preserve">A Yellow Alert will be issued when the path and strength of typhoon has been established and may affect the Rong Doi within 36 hours or is within 750 </w:t>
-      </w:r>
+        <w:t xml:space="preserve">A Yellow Alert will be issued when the path and strength of typhoon </w:t>
+      </w:r>
+      <w:proofErr w:type="gramStart"/>
       <w:r>
         <w:rPr>
           <w:bCs/>
           <w:szCs w:val="24"/>
         </w:rPr>
-        <w:t>- 240 n</w:t>
-      </w:r>
+        <w:t>has</w:t>
+      </w:r>
+      <w:proofErr w:type="gramEnd"/>
       <w:r>
         <w:rPr>
           <w:bCs/>
           <w:szCs w:val="24"/>
         </w:rPr>
+        <w:t xml:space="preserve"> been established and may affect the Rong Doi within 36 hours or is within 750 </w:t>
+      </w:r>
+      <w:r>
+        <w:rPr>
+          <w:bCs/>
+          <w:szCs w:val="24"/>
+        </w:rPr>
+        <w:t xml:space="preserve">- 240 </w:t>
+      </w:r>
+      <w:proofErr w:type="spellStart"/>
+      <w:r>
+        <w:rPr>
+          <w:bCs/>
+          <w:szCs w:val="24"/>
+        </w:rPr>
+        <w:t>n</w:t>
+      </w:r>
+      <w:r>
+        <w:rPr>
+          <w:bCs/>
+          <w:szCs w:val="24"/>
+        </w:rPr>
         <w:t>M</w:t>
       </w:r>
+      <w:proofErr w:type="spellEnd"/>
       <w:r>
         <w:rPr>
           <w:bCs/>
@@ -20154,7 +21729,23 @@
               </w:rPr>
             </w:pPr>
             <w:r>
-              <w:t>Liaise with Supply boats – demob vessel and non-essential personnel on vessel to safe haven if deemed necessary</w:t>
+              <w:t xml:space="preserve">Liaise with Supply boats – </w:t>
+            </w:r>
+            <w:proofErr w:type="spellStart"/>
+            <w:r>
+              <w:t>demob</w:t>
+            </w:r>
+            <w:proofErr w:type="spellEnd"/>
+            <w:r>
+              <w:t xml:space="preserve"> vessel and non-essential personnel on vessel to </w:t>
+            </w:r>
+            <w:proofErr w:type="gramStart"/>
+            <w:r>
+              <w:t>safe haven</w:t>
+            </w:r>
+            <w:proofErr w:type="gramEnd"/>
+            <w:r>
+              <w:t xml:space="preserve"> if deemed necessary</w:t>
             </w:r>
           </w:p>
         </w:tc>
@@ -20181,7 +21772,15 @@
               <w:jc w:val="both"/>
             </w:pPr>
             <w:r>
-              <w:t xml:space="preserve">Determine the need for early evacuation taking into consideration helicopter limitations and the number of persons that need to be evacuated from the facility and adjoining FSO. </w:t>
+              <w:t xml:space="preserve">Determine the need for early evacuation taking into consideration helicopter limitations and the number of </w:t>
+            </w:r>
+            <w:proofErr w:type="gramStart"/>
+            <w:r>
+              <w:t>persons</w:t>
+            </w:r>
+            <w:proofErr w:type="gramEnd"/>
+            <w:r>
+              <w:t xml:space="preserve"> that need to be evacuated from the facility and adjoining FSO. </w:t>
             </w:r>
           </w:p>
         </w:tc>
@@ -20211,7 +21810,23 @@
               </w:rPr>
             </w:pPr>
             <w:r>
-              <w:t>Ensure Nav –aids and Non directional beacon are operational</w:t>
+              <w:t xml:space="preserve">Ensure Nav –aids and </w:t>
+            </w:r>
+            <w:proofErr w:type="gramStart"/>
+            <w:r>
+              <w:t>Non</w:t>
+            </w:r>
+            <w:proofErr w:type="gramEnd"/>
+            <w:r>
+              <w:t xml:space="preserve"> directional beacon </w:t>
+            </w:r>
+            <w:proofErr w:type="gramStart"/>
+            <w:r>
+              <w:t>are</w:t>
+            </w:r>
+            <w:proofErr w:type="gramEnd"/>
+            <w:r>
+              <w:t xml:space="preserve"> operational</w:t>
             </w:r>
           </w:p>
         </w:tc>
@@ -20631,6 +22246,7 @@
         </w:rPr>
         <w:t xml:space="preserve">  RED </w:t>
       </w:r>
+      <w:proofErr w:type="gramStart"/>
       <w:r>
         <w:rPr>
           <w:b/>
@@ -20647,6 +22263,7 @@
         </w:rPr>
         <w:t>..</w:t>
       </w:r>
+      <w:proofErr w:type="gramEnd"/>
       <w:r>
         <w:rPr>
           <w:b/>
@@ -20670,7 +22287,23 @@
           <w:bCs/>
           <w:szCs w:val="24"/>
         </w:rPr>
-        <w:t>A Red Alert will be issued when the path and strength of typhoon has been established and will affect the Rong Doi field within 24 hours or is less than 240 NM from the field.</w:t>
+        <w:t xml:space="preserve">A Red Alert will be issued when the path and strength of typhoon </w:t>
+      </w:r>
+      <w:proofErr w:type="gramStart"/>
+      <w:r>
+        <w:rPr>
+          <w:bCs/>
+          <w:szCs w:val="24"/>
+        </w:rPr>
+        <w:t>has</w:t>
+      </w:r>
+      <w:proofErr w:type="gramEnd"/>
+      <w:r>
+        <w:rPr>
+          <w:bCs/>
+          <w:szCs w:val="24"/>
+        </w:rPr>
+        <w:t xml:space="preserve"> been established and will affect the Rong Doi field within 24 hours or is less than 240 NM from the field.</w:t>
       </w:r>
     </w:p>
     <w:tbl>
@@ -21060,7 +22693,15 @@
               </w:rPr>
             </w:pPr>
             <w:r>
-              <w:t>Upon instruction from the IM (OIM) or his designate - shutdown and de-pressure production facilities. (ESD-1) Ensure the Well SCSSVs are in the closed position</w:t>
+              <w:t xml:space="preserve">Upon instruction from the IM (OIM) or his </w:t>
+            </w:r>
+            <w:proofErr w:type="gramStart"/>
+            <w:r>
+              <w:t>designate</w:t>
+            </w:r>
+            <w:proofErr w:type="gramEnd"/>
+            <w:r>
+              <w:t xml:space="preserve"> - shutdown and de-pressure production facilities. (ESD-1) Ensure the Well SCSSVs are in the closed position</w:t>
             </w:r>
           </w:p>
         </w:tc>
@@ -21335,7 +22976,15 @@
               <w:jc w:val="both"/>
             </w:pPr>
             <w:r>
-              <w:t>Inform FSO and other field support vessels / services as to Red Alert status.</w:t>
+              <w:t xml:space="preserve">Inform FSO and other </w:t>
+            </w:r>
+            <w:proofErr w:type="gramStart"/>
+            <w:r>
+              <w:t>field</w:t>
+            </w:r>
+            <w:proofErr w:type="gramEnd"/>
+            <w:r>
+              <w:t xml:space="preserve"> support vessels / services as to Red Alert status.</w:t>
             </w:r>
           </w:p>
         </w:tc>
@@ -21654,7 +23303,15 @@
               <w:jc w:val="both"/>
             </w:pPr>
             <w:r>
-              <w:t xml:space="preserve">To initiate onshore emergency response, contacting the </w:t>
+              <w:t xml:space="preserve">To initiate onshore emergency response, </w:t>
+            </w:r>
+            <w:proofErr w:type="gramStart"/>
+            <w:r>
+              <w:t>contacting</w:t>
+            </w:r>
+            <w:proofErr w:type="gramEnd"/>
+            <w:r>
+              <w:t xml:space="preserve"> the </w:t>
             </w:r>
             <w:r>
               <w:t>IMT</w:t>
@@ -21752,25 +23409,41 @@
         <w:rPr>
           <w:szCs w:val="24"/>
         </w:rPr>
-        <w:t xml:space="preserve">Priority of personnel returning to the Rong Doi field is at the discretion of the </w:t>
-      </w:r>
+        <w:t xml:space="preserve">Priority of personnel returning to the Rong Doi field is at the discretion of </w:t>
+      </w:r>
+      <w:proofErr w:type="gramStart"/>
       <w:r>
         <w:rPr>
           <w:szCs w:val="24"/>
         </w:rPr>
+        <w:t xml:space="preserve">the </w:t>
+      </w:r>
+      <w:r>
+        <w:rPr>
+          <w:szCs w:val="24"/>
+        </w:rPr>
         <w:t>DIM</w:t>
       </w:r>
+      <w:proofErr w:type="gramEnd"/>
       <w:r>
         <w:rPr>
           <w:szCs w:val="24"/>
         </w:rPr>
         <w:t xml:space="preserve"> and </w:t>
       </w:r>
+      <w:proofErr w:type="gramStart"/>
       <w:r>
         <w:rPr>
           <w:szCs w:val="24"/>
         </w:rPr>
-        <w:t>the IM (OIM).</w:t>
+        <w:t>the IM</w:t>
+      </w:r>
+      <w:proofErr w:type="gramEnd"/>
+      <w:r>
+        <w:rPr>
+          <w:szCs w:val="24"/>
+        </w:rPr>
+        <w:t xml:space="preserve"> (OIM).</w:t>
       </w:r>
       <w:r>
         <w:rPr>
@@ -21788,6 +23461,25 @@
     </w:sectPr>
   </w:body>
 </w:document>
+</file>
+
+<file path=word/endnotes.xml><?xml version="1.0" encoding="utf-8"?>
+<w:endnotes xmlns:wpc="http://schemas.microsoft.com/office/word/2010/wordprocessingCanvas" xmlns:cx="http://schemas.microsoft.com/office/drawing/2014/chartex" xmlns:cx1="http://schemas.microsoft.com/office/drawing/2015/9/8/chartex" xmlns:cx2="http://schemas.microsoft.com/office/drawing/2015/10/21/chartex" xmlns:cx3="http://schemas.microsoft.com/office/drawing/2016/5/9/chartex" xmlns:cx4="http://schemas.microsoft.com/office/drawing/2016/5/10/chartex" xmlns:cx5="http://schemas.microsoft.com/office/drawing/2016/5/11/chartex" xmlns:cx6="http://schemas.microsoft.com/office/drawing/2016/5/12/chartex" xmlns:cx7="http://schemas.microsoft.com/office/drawing/2016/5/13/chartex" xmlns:cx8="http://schemas.microsoft.com/office/drawing/2016/5/14/chartex" xmlns:mc="http://schemas.openxmlformats.org/markup-compatibility/2006" xmlns:aink="http://schemas.microsoft.com/office/drawing/2016/ink" xmlns:am3d="http://schemas.microsoft.com/office/drawing/2017/model3d" xmlns:o="urn:schemas-microsoft-com:office:office" xmlns:oel="http://schemas.microsoft.com/office/2019/extlst" xmlns:r="http://schemas.openxmlformats.org/officeDocument/2006/relationships" xmlns:m="http://schemas.openxmlformats.org/officeDocument/2006/math" xmlns:v="urn:schemas-microsoft-com:vml" xmlns:wp14="http://schemas.microsoft.com/office/word/2010/wordprocessingDrawing" xmlns:wp="http://schemas.openxmlformats.org/drawingml/2006/wordprocessingDrawing" xmlns:w10="urn:schemas-microsoft-com:office:word" xmlns:w="http://schemas.openxmlformats.org/wordprocessingml/2006/main" xmlns:w14="http://schemas.microsoft.com/office/word/2010/wordml" xmlns:w15="http://schemas.microsoft.com/office/word/2012/wordml" xmlns:w16cex="http://schemas.microsoft.com/office/word/2018/wordml/cex" xmlns:w16cid="http://schemas.microsoft.com/office/word/2016/wordml/cid" xmlns:w16="http://schemas.microsoft.com/office/word/2018/wordml" xmlns:w16du="http://schemas.microsoft.com/office/word/2023/wordml/word16du" xmlns:w16sdtdh="http://schemas.microsoft.com/office/word/2020/wordml/sdtdatahash" xmlns:w16sdtfl="http://schemas.microsoft.com/office/word/2024/wordml/sdtformatlock" xmlns:w16se="http://schemas.microsoft.com/office/word/2015/wordml/symex" xmlns:wpg="http://schemas.microsoft.com/office/word/2010/wordprocessingGroup" xmlns:wpi="http://schemas.microsoft.com/office/word/2010/wordprocessingInk" xmlns:wne="http://schemas.microsoft.com/office/word/2006/wordml" xmlns:wps="http://schemas.microsoft.com/office/word/2010/wordprocessingShape" mc:Ignorable="w14 w15 w16se w16cid w16 w16cex w16sdtdh w16sdtfl w16du wp14">
+  <w:endnote w:type="separator" w:id="-1">
+    <w:p>
+      <w:r>
+        <w:separator/>
+      </w:r>
+    </w:p>
+  </w:endnote>
+  <w:endnote w:type="continuationSeparator" w:id="0">
+    <w:p>
+      <w:r>
+        <w:continuationSeparator/>
+      </w:r>
+    </w:p>
+  </w:endnote>
+</w:endnotes>
 </file>
 
 <file path=word/footer1.xml><?xml version="1.0" encoding="utf-8"?>
@@ -21969,6 +23661,25 @@
     </w:pPr>
   </w:p>
 </w:ftr>
+</file>
+
+<file path=word/footnotes.xml><?xml version="1.0" encoding="utf-8"?>
+<w:footnotes xmlns:wpc="http://schemas.microsoft.com/office/word/2010/wordprocessingCanvas" xmlns:cx="http://schemas.microsoft.com/office/drawing/2014/chartex" xmlns:cx1="http://schemas.microsoft.com/office/drawing/2015/9/8/chartex" xmlns:cx2="http://schemas.microsoft.com/office/drawing/2015/10/21/chartex" xmlns:cx3="http://schemas.microsoft.com/office/drawing/2016/5/9/chartex" xmlns:cx4="http://schemas.microsoft.com/office/drawing/2016/5/10/chartex" xmlns:cx5="http://schemas.microsoft.com/office/drawing/2016/5/11/chartex" xmlns:cx6="http://schemas.microsoft.com/office/drawing/2016/5/12/chartex" xmlns:cx7="http://schemas.microsoft.com/office/drawing/2016/5/13/chartex" xmlns:cx8="http://schemas.microsoft.com/office/drawing/2016/5/14/chartex" xmlns:mc="http://schemas.openxmlformats.org/markup-compatibility/2006" xmlns:aink="http://schemas.microsoft.com/office/drawing/2016/ink" xmlns:am3d="http://schemas.microsoft.com/office/drawing/2017/model3d" xmlns:o="urn:schemas-microsoft-com:office:office" xmlns:oel="http://schemas.microsoft.com/office/2019/extlst" xmlns:r="http://schemas.openxmlformats.org/officeDocument/2006/relationships" xmlns:m="http://schemas.openxmlformats.org/officeDocument/2006/math" xmlns:v="urn:schemas-microsoft-com:vml" xmlns:wp14="http://schemas.microsoft.com/office/word/2010/wordprocessingDrawing" xmlns:wp="http://schemas.openxmlformats.org/drawingml/2006/wordprocessingDrawing" xmlns:w10="urn:schemas-microsoft-com:office:word" xmlns:w="http://schemas.openxmlformats.org/wordprocessingml/2006/main" xmlns:w14="http://schemas.microsoft.com/office/word/2010/wordml" xmlns:w15="http://schemas.microsoft.com/office/word/2012/wordml" xmlns:w16cex="http://schemas.microsoft.com/office/word/2018/wordml/cex" xmlns:w16cid="http://schemas.microsoft.com/office/word/2016/wordml/cid" xmlns:w16="http://schemas.microsoft.com/office/word/2018/wordml" xmlns:w16du="http://schemas.microsoft.com/office/word/2023/wordml/word16du" xmlns:w16sdtdh="http://schemas.microsoft.com/office/word/2020/wordml/sdtdatahash" xmlns:w16sdtfl="http://schemas.microsoft.com/office/word/2024/wordml/sdtformatlock" xmlns:w16se="http://schemas.microsoft.com/office/word/2015/wordml/symex" xmlns:wpg="http://schemas.microsoft.com/office/word/2010/wordprocessingGroup" xmlns:wpi="http://schemas.microsoft.com/office/word/2010/wordprocessingInk" xmlns:wne="http://schemas.microsoft.com/office/word/2006/wordml" xmlns:wps="http://schemas.microsoft.com/office/word/2010/wordprocessingShape" mc:Ignorable="w14 w15 w16se w16cid w16 w16cex w16sdtdh w16sdtfl w16du wp14">
+  <w:footnote w:type="separator" w:id="-1">
+    <w:p>
+      <w:r>
+        <w:separator/>
+      </w:r>
+    </w:p>
+  </w:footnote>
+  <w:footnote w:type="continuationSeparator" w:id="0">
+    <w:p>
+      <w:r>
+        <w:continuationSeparator/>
+      </w:r>
+    </w:p>
+  </w:footnote>
+</w:footnotes>
 </file>
 
 <file path=word/header1.xml><?xml version="1.0" encoding="utf-8"?>

</xml_diff>